<commit_message>
pushesito a main, si señor, ahvo
</commit_message>
<xml_diff>
--- a/Propuesta de Proyecto.docx
+++ b/Propuesta de Proyecto.docx
@@ -1,6 +1,6 @@
 
 <file path=word/document.xml><?xml version="1.0" encoding="utf-8"?>
-<w:document xmlns:wpc="http://schemas.microsoft.com/office/word/2010/wordprocessingCanvas" xmlns:cx="http://schemas.microsoft.com/office/drawing/2014/chartex" xmlns:cx1="http://schemas.microsoft.com/office/drawing/2015/9/8/chartex" xmlns:cx2="http://schemas.microsoft.com/office/drawing/2015/10/21/chartex" xmlns:cx3="http://schemas.microsoft.com/office/drawing/2016/5/9/chartex" xmlns:cx4="http://schemas.microsoft.com/office/drawing/2016/5/10/chartex" xmlns:cx5="http://schemas.microsoft.com/office/drawing/2016/5/11/chartex" xmlns:cx6="http://schemas.microsoft.com/office/drawing/2016/5/12/chartex" xmlns:cx7="http://schemas.microsoft.com/office/drawing/2016/5/13/chartex" xmlns:cx8="http://schemas.microsoft.com/office/drawing/2016/5/14/chartex" xmlns:mc="http://schemas.openxmlformats.org/markup-compatibility/2006" xmlns:aink="http://schemas.microsoft.com/office/drawing/2016/ink" xmlns:am3d="http://schemas.microsoft.com/office/drawing/2017/model3d" xmlns:o="urn:schemas-microsoft-com:office:office" xmlns:oel="http://schemas.microsoft.com/office/2019/extlst" xmlns:r="http://schemas.openxmlformats.org/officeDocument/2006/relationships" xmlns:m="http://schemas.openxmlformats.org/officeDocument/2006/math" xmlns:v="urn:schemas-microsoft-com:vml" xmlns:wp14="http://schemas.microsoft.com/office/word/2010/wordprocessingDrawing" xmlns:wp="http://schemas.openxmlformats.org/drawingml/2006/wordprocessingDrawing" xmlns:w10="urn:schemas-microsoft-com:office:word" xmlns:w="http://schemas.openxmlformats.org/wordprocessingml/2006/main" xmlns:w14="http://schemas.microsoft.com/office/word/2010/wordml" xmlns:w15="http://schemas.microsoft.com/office/word/2012/wordml" xmlns:w16cex="http://schemas.microsoft.com/office/word/2018/wordml/cex" xmlns:w16cid="http://schemas.microsoft.com/office/word/2016/wordml/cid" xmlns:w16="http://schemas.microsoft.com/office/word/2018/wordml" xmlns:w16du="http://schemas.microsoft.com/office/word/2023/wordml/word16du" xmlns:w16sdtdh="http://schemas.microsoft.com/office/word/2020/wordml/sdtdatahash" xmlns:w16sdtfl="http://schemas.microsoft.com/office/word/2024/wordml/sdtformatlock" xmlns:w16se="http://schemas.microsoft.com/office/word/2015/wordml/symex" xmlns:wpg="http://schemas.microsoft.com/office/word/2010/wordprocessingGroup" xmlns:wpi="http://schemas.microsoft.com/office/word/2010/wordprocessingInk" xmlns:wne="http://schemas.microsoft.com/office/word/2006/wordml" xmlns:wps="http://schemas.microsoft.com/office/word/2010/wordprocessingShape" xmlns:a="http://schemas.openxmlformats.org/drawingml/2006/main" xmlns:a16="http://schemas.microsoft.com/office/drawing/2014/main" xmlns:pic="http://schemas.openxmlformats.org/drawingml/2006/picture" xmlns:a14="http://schemas.microsoft.com/office/drawing/2010/main" mc:Ignorable="w14 w15 w16se w16cid w16 w16cex w16sdtdh w16sdtfl w16du wp14">
+<w:document xmlns:wpc="http://schemas.microsoft.com/office/word/2010/wordprocessingCanvas" xmlns:cx="http://schemas.microsoft.com/office/drawing/2014/chartex" xmlns:cx1="http://schemas.microsoft.com/office/drawing/2015/9/8/chartex" xmlns:cx2="http://schemas.microsoft.com/office/drawing/2015/10/21/chartex" xmlns:cx3="http://schemas.microsoft.com/office/drawing/2016/5/9/chartex" xmlns:cx4="http://schemas.microsoft.com/office/drawing/2016/5/10/chartex" xmlns:cx5="http://schemas.microsoft.com/office/drawing/2016/5/11/chartex" xmlns:cx6="http://schemas.microsoft.com/office/drawing/2016/5/12/chartex" xmlns:cx7="http://schemas.microsoft.com/office/drawing/2016/5/13/chartex" xmlns:cx8="http://schemas.microsoft.com/office/drawing/2016/5/14/chartex" xmlns:mc="http://schemas.openxmlformats.org/markup-compatibility/2006" xmlns:aink="http://schemas.microsoft.com/office/drawing/2016/ink" xmlns:am3d="http://schemas.microsoft.com/office/drawing/2017/model3d" xmlns:o="urn:schemas-microsoft-com:office:office" xmlns:oel="http://schemas.microsoft.com/office/2019/extlst" xmlns:r="http://schemas.openxmlformats.org/officeDocument/2006/relationships" xmlns:m="http://schemas.openxmlformats.org/officeDocument/2006/math" xmlns:v="urn:schemas-microsoft-com:vml" xmlns:wp14="http://schemas.microsoft.com/office/word/2010/wordprocessingDrawing" xmlns:wp="http://schemas.openxmlformats.org/drawingml/2006/wordprocessingDrawing" xmlns:w10="urn:schemas-microsoft-com:office:word" xmlns:w="http://schemas.openxmlformats.org/wordprocessingml/2006/main" xmlns:w14="http://schemas.microsoft.com/office/word/2010/wordml" xmlns:w15="http://schemas.microsoft.com/office/word/2012/wordml" xmlns:w16cex="http://schemas.microsoft.com/office/word/2018/wordml/cex" xmlns:w16cid="http://schemas.microsoft.com/office/word/2016/wordml/cid" xmlns:w16="http://schemas.microsoft.com/office/word/2018/wordml" xmlns:w16du="http://schemas.microsoft.com/office/word/2023/wordml/word16du" xmlns:w16sdtdh="http://schemas.microsoft.com/office/word/2020/wordml/sdtdatahash" xmlns:w16sdtfl="http://schemas.microsoft.com/office/word/2024/wordml/sdtformatlock" xmlns:w16se="http://schemas.microsoft.com/office/word/2015/wordml/symex" xmlns:wpg="http://schemas.microsoft.com/office/word/2010/wordprocessingGroup" xmlns:wpi="http://schemas.microsoft.com/office/word/2010/wordprocessingInk" xmlns:wne="http://schemas.microsoft.com/office/word/2006/wordml" xmlns:wps="http://schemas.microsoft.com/office/word/2010/wordprocessingShape" mc:Ignorable="w14 w15 w16se w16cid w16 w16cex w16sdtdh w16sdtfl w16du wp14">
   <w:body>
     <w:p>
       <w:pPr>
@@ -155,88 +155,6 @@
       <w:pPr>
         <w:jc w:val="center"/>
         <w:rPr>
-          <w:b w:val="1"/>
-          <w:bCs w:val="1"/>
-          <w:sz w:val="36"/>
-          <w:szCs w:val="36"/>
-          <w:lang w:val="es-MX"/>
-        </w:rPr>
-      </w:pPr>
-      <w:r>
-        <w:rPr>
-          <w:b w:val="1"/>
-          <w:bCs w:val="1"/>
-          <w:sz w:val="36"/>
-          <w:szCs w:val="36"/>
-          <w:lang w:val="es-MX"/>
-        </w:rPr>
-        <w:t>1</w:t>
-      </w:r>
-      <w:r>
-        <w:rPr>
-          <w:b w:val="1"/>
-          <w:bCs w:val="1"/>
-          <w:sz w:val="36"/>
-          <w:szCs w:val="36"/>
-          <w:lang w:val="es-MX"/>
-        </w:rPr>
-        <w:t>7</w:t>
-      </w:r>
-      <w:r>
-        <w:rPr>
-          <w:b w:val="1"/>
-          <w:bCs w:val="1"/>
-          <w:sz w:val="36"/>
-          <w:szCs w:val="36"/>
-          <w:lang w:val="es-MX"/>
-        </w:rPr>
-        <w:t xml:space="preserve"> DE </w:t>
-      </w:r>
-      <w:r>
-        <w:rPr>
-          <w:b w:val="1"/>
-          <w:bCs w:val="1"/>
-          <w:sz w:val="36"/>
-          <w:szCs w:val="36"/>
-          <w:lang w:val="es-MX"/>
-        </w:rPr>
-        <w:t>ABRIL</w:t>
-      </w:r>
-      <w:r>
-        <w:rPr>
-          <w:b w:val="1"/>
-          <w:bCs w:val="1"/>
-          <w:sz w:val="36"/>
-          <w:szCs w:val="36"/>
-          <w:lang w:val="es-MX"/>
-        </w:rPr>
-        <w:t xml:space="preserve"> </w:t>
-      </w:r>
-      <w:r>
-        <w:rPr>
-          <w:b w:val="1"/>
-          <w:bCs w:val="1"/>
-          <w:sz w:val="36"/>
-          <w:szCs w:val="36"/>
-          <w:lang w:val="es-MX"/>
-        </w:rPr>
-        <w:t>DE 202</w:t>
-      </w:r>
-      <w:r>
-        <w:rPr>
-          <w:b w:val="1"/>
-          <w:bCs w:val="1"/>
-          <w:sz w:val="36"/>
-          <w:szCs w:val="36"/>
-          <w:lang w:val="es-MX"/>
-        </w:rPr>
-        <w:t>6</w:t>
-      </w:r>
-    </w:p>
-    <w:p>
-      <w:pPr>
-        <w:jc w:val="center"/>
-        <w:rPr>
           <w:b/>
           <w:bCs/>
           <w:sz w:val="36"/>
@@ -252,12 +170,9 @@
           <w:szCs w:val="36"/>
           <w:lang w:val="es-MX"/>
         </w:rPr>
-        <w:t>ESTRUCTURA DE DATOS</w:t>
-      </w:r>
-    </w:p>
-    <w:p>
-      <w:pPr>
-        <w:jc w:val="center"/>
+        <w:t>1</w:t>
+      </w:r>
+      <w:r>
         <w:rPr>
           <w:b/>
           <w:bCs/>
@@ -265,7 +180,8 @@
           <w:szCs w:val="36"/>
           <w:lang w:val="es-MX"/>
         </w:rPr>
-      </w:pPr>
+        <w:t>7</w:t>
+      </w:r>
       <w:r>
         <w:rPr>
           <w:b/>
@@ -274,7 +190,7 @@
           <w:szCs w:val="36"/>
           <w:lang w:val="es-MX"/>
         </w:rPr>
-        <w:t>M.I.A. ERNESTO JESÚS SOL</w:t>
+        <w:t xml:space="preserve"> DE </w:t>
       </w:r>
       <w:r>
         <w:rPr>
@@ -284,12 +200,9 @@
           <w:szCs w:val="36"/>
           <w:lang w:val="es-MX"/>
         </w:rPr>
-        <w:t>ÍS VALENZUELA</w:t>
-      </w:r>
-    </w:p>
-    <w:p>
-      <w:pPr>
-        <w:jc w:val="center"/>
+        <w:t>ABRIL</w:t>
+      </w:r>
+      <w:r>
         <w:rPr>
           <w:b/>
           <w:bCs/>
@@ -297,11 +210,9 @@
           <w:szCs w:val="36"/>
           <w:lang w:val="es-MX"/>
         </w:rPr>
-      </w:pPr>
-    </w:p>
-    <w:p>
-      <w:pPr>
-        <w:jc w:val="center"/>
+        <w:t xml:space="preserve"> </w:t>
+      </w:r>
+      <w:r>
         <w:rPr>
           <w:b/>
           <w:bCs/>
@@ -309,11 +220,9 @@
           <w:szCs w:val="36"/>
           <w:lang w:val="es-MX"/>
         </w:rPr>
-      </w:pPr>
-    </w:p>
-    <w:p>
-      <w:pPr>
-        <w:jc w:val="center"/>
+        <w:t>DE 202</w:t>
+      </w:r>
+      <w:r>
         <w:rPr>
           <w:b/>
           <w:bCs/>
@@ -321,7 +230,8 @@
           <w:szCs w:val="36"/>
           <w:lang w:val="es-MX"/>
         </w:rPr>
-      </w:pPr>
+        <w:t>6</w:t>
+      </w:r>
     </w:p>
     <w:p>
       <w:pPr>
@@ -334,10 +244,7 @@
           <w:lang w:val="es-MX"/>
         </w:rPr>
       </w:pPr>
-    </w:p>
-    <w:p>
-      <w:pPr>
-        <w:jc w:val="center"/>
+      <w:r>
         <w:rPr>
           <w:b/>
           <w:bCs/>
@@ -345,8 +252,12 @@
           <w:szCs w:val="36"/>
           <w:lang w:val="es-MX"/>
         </w:rPr>
-      </w:pPr>
-      <w:r>
+        <w:t>ESTRUCTURA DE DATOS</w:t>
+      </w:r>
+    </w:p>
+    <w:p>
+      <w:pPr>
+        <w:jc w:val="center"/>
         <w:rPr>
           <w:b/>
           <w:bCs/>
@@ -354,12 +265,8 @@
           <w:szCs w:val="36"/>
           <w:lang w:val="es-MX"/>
         </w:rPr>
-        <w:t>PROPUESTA DE PIA</w:t>
-      </w:r>
-    </w:p>
-    <w:p>
-      <w:pPr>
-        <w:jc w:val="center"/>
+      </w:pPr>
+      <w:r>
         <w:rPr>
           <w:b/>
           <w:bCs/>
@@ -367,11 +274,9 @@
           <w:szCs w:val="36"/>
           <w:lang w:val="es-MX"/>
         </w:rPr>
-      </w:pPr>
-    </w:p>
-    <w:p>
-      <w:pPr>
-        <w:jc w:val="center"/>
+        <w:t>M.I.A. ERNESTO JESÚS SOL</w:t>
+      </w:r>
+      <w:r>
         <w:rPr>
           <w:b/>
           <w:bCs/>
@@ -379,7 +284,8 @@
           <w:szCs w:val="36"/>
           <w:lang w:val="es-MX"/>
         </w:rPr>
-      </w:pPr>
+        <w:t>ÍS VALENZUELA</w:t>
+      </w:r>
     </w:p>
     <w:p>
       <w:pPr>
@@ -392,7 +298,10 @@
           <w:lang w:val="es-MX"/>
         </w:rPr>
       </w:pPr>
-      <w:r>
+    </w:p>
+    <w:p>
+      <w:pPr>
+        <w:jc w:val="center"/>
         <w:rPr>
           <w:b/>
           <w:bCs/>
@@ -400,8 +309,7 @@
           <w:szCs w:val="36"/>
           <w:lang w:val="es-MX"/>
         </w:rPr>
-        <w:t>EQUIPO 3</w:t>
-      </w:r>
+      </w:pPr>
     </w:p>
     <w:p>
       <w:pPr>
@@ -414,7 +322,10 @@
           <w:lang w:val="es-MX"/>
         </w:rPr>
       </w:pPr>
-      <w:r>
+    </w:p>
+    <w:p>
+      <w:pPr>
+        <w:jc w:val="center"/>
         <w:rPr>
           <w:b/>
           <w:bCs/>
@@ -422,9 +333,11 @@
           <w:szCs w:val="36"/>
           <w:lang w:val="es-MX"/>
         </w:rPr>
-        <w:t>2148314 JOSE</w:t>
-      </w:r>
-      <w:r>
+      </w:pPr>
+    </w:p>
+    <w:p>
+      <w:pPr>
+        <w:jc w:val="center"/>
         <w:rPr>
           <w:b/>
           <w:bCs/>
@@ -432,8 +345,7 @@
           <w:szCs w:val="36"/>
           <w:lang w:val="es-MX"/>
         </w:rPr>
-        <w:t xml:space="preserve"> SANTIAGO </w:t>
-      </w:r>
+      </w:pPr>
       <w:r>
         <w:rPr>
           <w:b/>
@@ -442,7 +354,7 @@
           <w:szCs w:val="36"/>
           <w:lang w:val="es-MX"/>
         </w:rPr>
-        <w:t>CASTRO REYES</w:t>
+        <w:t>PROPUESTA DE PIA</w:t>
       </w:r>
     </w:p>
     <w:p>
@@ -456,7 +368,10 @@
           <w:lang w:val="es-MX"/>
         </w:rPr>
       </w:pPr>
-      <w:r>
+    </w:p>
+    <w:p>
+      <w:pPr>
+        <w:jc w:val="center"/>
         <w:rPr>
           <w:b/>
           <w:bCs/>
@@ -464,9 +379,11 @@
           <w:szCs w:val="36"/>
           <w:lang w:val="es-MX"/>
         </w:rPr>
-        <w:t xml:space="preserve">2069375 </w:t>
-      </w:r>
-      <w:r>
+      </w:pPr>
+    </w:p>
+    <w:p>
+      <w:pPr>
+        <w:jc w:val="center"/>
         <w:rPr>
           <w:b/>
           <w:bCs/>
@@ -474,8 +391,7 @@
           <w:szCs w:val="36"/>
           <w:lang w:val="es-MX"/>
         </w:rPr>
-        <w:t>C</w:t>
-      </w:r>
+      </w:pPr>
       <w:r>
         <w:rPr>
           <w:b/>
@@ -484,9 +400,12 @@
           <w:szCs w:val="36"/>
           <w:lang w:val="es-MX"/>
         </w:rPr>
-        <w:t>É</w:t>
-      </w:r>
-      <w:r>
+        <w:t>EQUIPO 3</w:t>
+      </w:r>
+    </w:p>
+    <w:p>
+      <w:pPr>
+        <w:jc w:val="center"/>
         <w:rPr>
           <w:b/>
           <w:bCs/>
@@ -494,8 +413,7 @@
           <w:szCs w:val="36"/>
           <w:lang w:val="es-MX"/>
         </w:rPr>
-        <w:t>SAR</w:t>
-      </w:r>
+      </w:pPr>
       <w:r>
         <w:rPr>
           <w:b/>
@@ -504,7 +422,7 @@
           <w:szCs w:val="36"/>
           <w:lang w:val="es-MX"/>
         </w:rPr>
-        <w:t xml:space="preserve"> </w:t>
+        <w:t>2148314 JOSE</w:t>
       </w:r>
       <w:r>
         <w:rPr>
@@ -514,7 +432,7 @@
           <w:szCs w:val="36"/>
           <w:lang w:val="es-MX"/>
         </w:rPr>
-        <w:t xml:space="preserve">YAHIR </w:t>
+        <w:t xml:space="preserve"> SANTIAGO </w:t>
       </w:r>
       <w:r>
         <w:rPr>
@@ -524,9 +442,12 @@
           <w:szCs w:val="36"/>
           <w:lang w:val="es-MX"/>
         </w:rPr>
-        <w:t xml:space="preserve">ALONSO </w:t>
-      </w:r>
-      <w:r>
+        <w:t>CASTRO REYES</w:t>
+      </w:r>
+    </w:p>
+    <w:p>
+      <w:pPr>
+        <w:jc w:val="center"/>
         <w:rPr>
           <w:b/>
           <w:bCs/>
@@ -534,12 +455,8 @@
           <w:szCs w:val="36"/>
           <w:lang w:val="es-MX"/>
         </w:rPr>
-        <w:t>REYES</w:t>
-      </w:r>
-    </w:p>
-    <w:p>
-      <w:pPr>
-        <w:jc w:val="center"/>
+      </w:pPr>
+      <w:r>
         <w:rPr>
           <w:b/>
           <w:bCs/>
@@ -547,7 +464,8 @@
           <w:szCs w:val="36"/>
           <w:lang w:val="es-MX"/>
         </w:rPr>
-      </w:pPr>
+        <w:t xml:space="preserve">2069375 </w:t>
+      </w:r>
       <w:r>
         <w:rPr>
           <w:b/>
@@ -556,7 +474,7 @@
           <w:szCs w:val="36"/>
           <w:lang w:val="es-MX"/>
         </w:rPr>
-        <w:t>2151976 EDSON</w:t>
+        <w:t>C</w:t>
       </w:r>
       <w:r>
         <w:rPr>
@@ -566,7 +484,7 @@
           <w:szCs w:val="36"/>
           <w:lang w:val="es-MX"/>
         </w:rPr>
-        <w:t xml:space="preserve"> ARMANDO AMAYA </w:t>
+        <w:t>É</w:t>
       </w:r>
       <w:r>
         <w:rPr>
@@ -576,12 +494,9 @@
           <w:szCs w:val="36"/>
           <w:lang w:val="es-MX"/>
         </w:rPr>
-        <w:t>MACIAS</w:t>
-      </w:r>
-    </w:p>
-    <w:p>
-      <w:pPr>
-        <w:jc w:val="center"/>
+        <w:t>SAR</w:t>
+      </w:r>
+      <w:r>
         <w:rPr>
           <w:b/>
           <w:bCs/>
@@ -589,7 +504,8 @@
           <w:szCs w:val="36"/>
           <w:lang w:val="es-MX"/>
         </w:rPr>
-      </w:pPr>
+        <w:t xml:space="preserve"> </w:t>
+      </w:r>
       <w:r>
         <w:rPr>
           <w:b/>
@@ -598,7 +514,7 @@
           <w:szCs w:val="36"/>
           <w:lang w:val="es-MX"/>
         </w:rPr>
-        <w:t>2087472 SEBASTIAN</w:t>
+        <w:t xml:space="preserve">YAHIR </w:t>
       </w:r>
       <w:r>
         <w:rPr>
@@ -608,7 +524,7 @@
           <w:szCs w:val="36"/>
           <w:lang w:val="es-MX"/>
         </w:rPr>
-        <w:t xml:space="preserve"> </w:t>
+        <w:t xml:space="preserve">ALONSO </w:t>
       </w:r>
       <w:r>
         <w:rPr>
@@ -618,9 +534,12 @@
           <w:szCs w:val="36"/>
           <w:lang w:val="es-MX"/>
         </w:rPr>
-        <w:t xml:space="preserve">CALDERON </w:t>
-      </w:r>
-      <w:r>
+        <w:t>REYES</w:t>
+      </w:r>
+    </w:p>
+    <w:p>
+      <w:pPr>
+        <w:jc w:val="center"/>
         <w:rPr>
           <w:b/>
           <w:bCs/>
@@ -628,18 +547,6 @@
           <w:szCs w:val="36"/>
           <w:lang w:val="es-MX"/>
         </w:rPr>
-        <w:t>CARRILLO</w:t>
-      </w:r>
-    </w:p>
-    <w:p>
-      <w:pPr>
-        <w:jc w:val="both"/>
-        <w:rPr>
-          <w:b/>
-          <w:sz w:val="44"/>
-          <w:szCs w:val="44"/>
-          <w:lang w:val="es-MX"/>
-        </w:rPr>
       </w:pPr>
       <w:r>
         <w:rPr>
@@ -649,6 +556,99 @@
           <w:szCs w:val="36"/>
           <w:lang w:val="es-MX"/>
         </w:rPr>
+        <w:t>2151976 EDSON</w:t>
+      </w:r>
+      <w:r>
+        <w:rPr>
+          <w:b/>
+          <w:bCs/>
+          <w:sz w:val="36"/>
+          <w:szCs w:val="36"/>
+          <w:lang w:val="es-MX"/>
+        </w:rPr>
+        <w:t xml:space="preserve"> ARMANDO AMAYA </w:t>
+      </w:r>
+      <w:r>
+        <w:rPr>
+          <w:b/>
+          <w:bCs/>
+          <w:sz w:val="36"/>
+          <w:szCs w:val="36"/>
+          <w:lang w:val="es-MX"/>
+        </w:rPr>
+        <w:t>MACIAS</w:t>
+      </w:r>
+    </w:p>
+    <w:p>
+      <w:pPr>
+        <w:jc w:val="center"/>
+        <w:rPr>
+          <w:b/>
+          <w:bCs/>
+          <w:sz w:val="36"/>
+          <w:szCs w:val="36"/>
+          <w:lang w:val="es-MX"/>
+        </w:rPr>
+      </w:pPr>
+      <w:r>
+        <w:rPr>
+          <w:b/>
+          <w:bCs/>
+          <w:sz w:val="36"/>
+          <w:szCs w:val="36"/>
+          <w:lang w:val="es-MX"/>
+        </w:rPr>
+        <w:t>2087472 SEBASTIAN</w:t>
+      </w:r>
+      <w:r>
+        <w:rPr>
+          <w:b/>
+          <w:bCs/>
+          <w:sz w:val="36"/>
+          <w:szCs w:val="36"/>
+          <w:lang w:val="es-MX"/>
+        </w:rPr>
+        <w:t xml:space="preserve"> </w:t>
+      </w:r>
+      <w:r>
+        <w:rPr>
+          <w:b/>
+          <w:bCs/>
+          <w:sz w:val="36"/>
+          <w:szCs w:val="36"/>
+          <w:lang w:val="es-MX"/>
+        </w:rPr>
+        <w:t xml:space="preserve">CALDERON </w:t>
+      </w:r>
+      <w:r>
+        <w:rPr>
+          <w:b/>
+          <w:bCs/>
+          <w:sz w:val="36"/>
+          <w:szCs w:val="36"/>
+          <w:lang w:val="es-MX"/>
+        </w:rPr>
+        <w:t>CARRILLO</w:t>
+      </w:r>
+    </w:p>
+    <w:p>
+      <w:pPr>
+        <w:jc w:val="both"/>
+        <w:rPr>
+          <w:b/>
+          <w:sz w:val="44"/>
+          <w:szCs w:val="44"/>
+          <w:lang w:val="es-MX"/>
+        </w:rPr>
+      </w:pPr>
+      <w:r>
+        <w:rPr>
+          <w:b/>
+          <w:bCs/>
+          <w:sz w:val="36"/>
+          <w:szCs w:val="36"/>
+          <w:lang w:val="es-MX"/>
+        </w:rPr>
         <w:br w:type="page"/>
       </w:r>
       <w:r>
@@ -658,6 +658,7 @@
           <w:szCs w:val="32"/>
           <w:lang w:val="es-MX"/>
         </w:rPr>
+        <w:lastRenderedPageBreak/>
         <w:t>Introducción</w:t>
       </w:r>
     </w:p>
@@ -2200,70 +2201,6 @@
       </w:r>
       <w:r>
         <w:rPr>
-          <w:color w:val="FFFFFF" w:themeColor="background1"/>
-          <w:sz w:val="32"/>
-          <w:szCs w:val="32"/>
-          <w:lang w:val="es-MX"/>
-        </w:rPr>
-        <w:t xml:space="preserve"> un</w:t>
-      </w:r>
-      <w:r>
-        <w:rPr>
-          <w:color w:val="FFFFFF" w:themeColor="background1"/>
-          <w:sz w:val="32"/>
-          <w:szCs w:val="32"/>
-          <w:lang w:val="es-MX"/>
-        </w:rPr>
-        <w:t>a co</w:t>
-      </w:r>
-      <w:r>
-        <w:rPr>
-          <w:color w:val="FFFFFF" w:themeColor="background1"/>
-          <w:sz w:val="32"/>
-          <w:szCs w:val="32"/>
-          <w:lang w:val="es-MX"/>
-        </w:rPr>
-        <w:t xml:space="preserve">nfianza </w:t>
-      </w:r>
-      <w:r>
-        <w:rPr>
-          <w:color w:val="FFFFFF" w:themeColor="background1"/>
-          <w:sz w:val="32"/>
-          <w:szCs w:val="32"/>
-          <w:lang w:val="es-MX"/>
-        </w:rPr>
-        <w:t>entre el</w:t>
-      </w:r>
-      <w:r>
-        <w:rPr>
-          <w:color w:val="FFFFFF" w:themeColor="background1"/>
-          <w:sz w:val="32"/>
-          <w:szCs w:val="32"/>
-          <w:lang w:val="es-MX"/>
-        </w:rPr>
-        <w:t xml:space="preserve"> usuario </w:t>
-      </w:r>
-      <w:r>
-        <w:rPr>
-          <w:color w:val="FFFFFF" w:themeColor="background1"/>
-          <w:sz w:val="32"/>
-          <w:szCs w:val="32"/>
-          <w:lang w:val="es-MX"/>
-        </w:rPr>
-        <w:t>y la em</w:t>
-      </w:r>
-      <w:r>
-        <w:rPr>
-          <w:color w:val="FFFFFF" w:themeColor="background1"/>
-          <w:sz w:val="32"/>
-          <w:szCs w:val="32"/>
-          <w:lang w:val="es-MX"/>
-        </w:rPr>
-        <w:t>presa,</w:t>
-      </w:r>
-      <w:r>
-        <w:rPr>
-          <w:color w:val="FFFFFF" w:themeColor="background1"/>
           <w:sz w:val="32"/>
           <w:szCs w:val="32"/>
           <w:lang w:val="es-MX"/>
@@ -2272,176 +2209,6 @@
       </w:r>
       <w:r>
         <w:rPr>
-          <w:color w:val="FFFFFF" w:themeColor="background1"/>
-          <w:sz w:val="32"/>
-          <w:szCs w:val="32"/>
-          <w:lang w:val="es-MX"/>
-        </w:rPr>
-        <w:t>aume</w:t>
-      </w:r>
-      <w:r>
-        <w:rPr>
-          <w:color w:val="FFFFFF" w:themeColor="background1"/>
-          <w:sz w:val="32"/>
-          <w:szCs w:val="32"/>
-          <w:lang w:val="es-MX"/>
-        </w:rPr>
-        <w:t xml:space="preserve">ntando la </w:t>
-      </w:r>
-      <w:r>
-        <w:rPr>
-          <w:color w:val="FFFFFF" w:themeColor="background1"/>
-          <w:sz w:val="32"/>
-          <w:szCs w:val="32"/>
-          <w:lang w:val="es-MX"/>
-        </w:rPr>
-        <w:t>posibi</w:t>
-      </w:r>
-      <w:r>
-        <w:rPr>
-          <w:color w:val="FFFFFF" w:themeColor="background1"/>
-          <w:sz w:val="32"/>
-          <w:szCs w:val="32"/>
-          <w:lang w:val="es-MX"/>
-        </w:rPr>
-        <w:t>lidad q</w:t>
-      </w:r>
-      <w:r>
-        <w:rPr>
-          <w:color w:val="FFFFFF" w:themeColor="background1"/>
-          <w:sz w:val="32"/>
-          <w:szCs w:val="32"/>
-          <w:lang w:val="es-MX"/>
-        </w:rPr>
-        <w:t xml:space="preserve">ue </w:t>
-      </w:r>
-      <w:r>
-        <w:rPr>
-          <w:color w:val="FFFFFF" w:themeColor="background1"/>
-          <w:sz w:val="32"/>
-          <w:szCs w:val="32"/>
-          <w:lang w:val="es-MX"/>
-        </w:rPr>
-        <w:t>re</w:t>
-      </w:r>
-      <w:r>
-        <w:rPr>
-          <w:color w:val="FFFFFF" w:themeColor="background1"/>
-          <w:sz w:val="32"/>
-          <w:szCs w:val="32"/>
-          <w:lang w:val="es-MX"/>
-        </w:rPr>
-        <w:t>curra a</w:t>
-      </w:r>
-      <w:r>
-        <w:rPr>
-          <w:color w:val="FFFFFF" w:themeColor="background1"/>
-          <w:sz w:val="32"/>
-          <w:szCs w:val="32"/>
-          <w:lang w:val="es-MX"/>
-        </w:rPr>
-        <w:t xml:space="preserve"> la </w:t>
-      </w:r>
-      <w:r>
-        <w:rPr>
-          <w:color w:val="FFFFFF" w:themeColor="background1"/>
-          <w:sz w:val="32"/>
-          <w:szCs w:val="32"/>
-          <w:lang w:val="es-MX"/>
-        </w:rPr>
-        <w:t>compañía y</w:t>
-      </w:r>
-      <w:r>
-        <w:rPr>
-          <w:color w:val="FFFFFF" w:themeColor="background1"/>
-          <w:sz w:val="32"/>
-          <w:szCs w:val="32"/>
-          <w:lang w:val="es-MX"/>
-        </w:rPr>
-        <w:t xml:space="preserve"> </w:t>
-      </w:r>
-      <w:r>
-        <w:rPr>
-          <w:color w:val="FFFFFF" w:themeColor="background1"/>
-          <w:sz w:val="32"/>
-          <w:szCs w:val="32"/>
-          <w:lang w:val="es-MX"/>
-        </w:rPr>
-        <w:t xml:space="preserve">vuelva a </w:t>
-      </w:r>
-      <w:r>
-        <w:rPr>
-          <w:color w:val="FFFFFF" w:themeColor="background1"/>
-          <w:sz w:val="32"/>
-          <w:szCs w:val="32"/>
-          <w:lang w:val="es-MX"/>
-        </w:rPr>
-        <w:t>contra</w:t>
-      </w:r>
-      <w:r>
-        <w:rPr>
-          <w:color w:val="FFFFFF" w:themeColor="background1"/>
-          <w:sz w:val="32"/>
-          <w:szCs w:val="32"/>
-          <w:lang w:val="es-MX"/>
-        </w:rPr>
-        <w:t xml:space="preserve">tar </w:t>
-      </w:r>
-      <w:r>
-        <w:rPr>
-          <w:color w:val="FFFFFF" w:themeColor="background1"/>
-          <w:sz w:val="32"/>
-          <w:szCs w:val="32"/>
-          <w:lang w:val="es-MX"/>
-        </w:rPr>
-        <w:t>e</w:t>
-      </w:r>
-      <w:r>
-        <w:rPr>
-          <w:color w:val="FFFFFF" w:themeColor="background1"/>
-          <w:sz w:val="32"/>
-          <w:szCs w:val="32"/>
-          <w:lang w:val="es-MX"/>
-        </w:rPr>
-        <w:t>l</w:t>
-      </w:r>
-      <w:r>
-        <w:rPr>
-          <w:color w:val="FFFFFF" w:themeColor="background1"/>
-          <w:sz w:val="32"/>
-          <w:szCs w:val="32"/>
-          <w:lang w:val="es-MX"/>
-        </w:rPr>
-        <w:t xml:space="preserve"> servicio</w:t>
-      </w:r>
-      <w:r>
-        <w:rPr>
-          <w:color w:val="FFFFFF" w:themeColor="background1"/>
-          <w:sz w:val="32"/>
-          <w:szCs w:val="32"/>
-          <w:lang w:val="es-MX"/>
-        </w:rPr>
-        <w:t xml:space="preserve"> prop</w:t>
-      </w:r>
-      <w:r>
-        <w:rPr>
-          <w:color w:val="FFFFFF" w:themeColor="background1"/>
-          <w:sz w:val="32"/>
-          <w:szCs w:val="32"/>
-          <w:lang w:val="es-MX"/>
-        </w:rPr>
-        <w:t>orcionado</w:t>
-      </w:r>
-      <w:r>
-        <w:rPr>
-          <w:sz w:val="32"/>
-          <w:szCs w:val="32"/>
-          <w:lang w:val="es-MX"/>
-        </w:rPr>
-        <w:t>.</w:t>
-      </w:r>
-      <w:r>
-        <w:rPr>
           <w:sz w:val="32"/>
           <w:szCs w:val="32"/>
           <w:lang w:val="es-MX"/>
@@ -2466,6 +2233,7 @@
           <w:szCs w:val="32"/>
           <w:lang w:val="es-MX"/>
         </w:rPr>
+        <w:lastRenderedPageBreak/>
         <w:t>Definición</w:t>
       </w:r>
       <w:r>
@@ -2489,7 +2257,7 @@
       </w:pPr>
       <w:r>
         <w:rPr>
-          <w:rFonts w:ascii="Calibri" w:hAnsi="Calibri" w:eastAsia="Calibri" w:cs="Calibri"/>
+          <w:rFonts w:ascii="Calibri" w:eastAsia="Calibri" w:hAnsi="Calibri" w:cs="Calibri"/>
           <w:sz w:val="32"/>
           <w:szCs w:val="32"/>
           <w:lang w:val="es-MX"/>
@@ -2498,7 +2266,7 @@
       </w:r>
       <w:r>
         <w:rPr>
-          <w:rFonts w:ascii="Calibri" w:hAnsi="Calibri" w:eastAsia="Calibri" w:cs="Calibri"/>
+          <w:rFonts w:ascii="Calibri" w:eastAsia="Calibri" w:hAnsi="Calibri" w:cs="Calibri"/>
           <w:sz w:val="32"/>
           <w:szCs w:val="32"/>
           <w:lang w:val="es-MX"/>
@@ -2507,7 +2275,7 @@
       </w:r>
       <w:r>
         <w:rPr>
-          <w:rFonts w:ascii="Calibri" w:hAnsi="Calibri" w:eastAsia="Calibri" w:cs="Calibri"/>
+          <w:rFonts w:ascii="Calibri" w:eastAsia="Calibri" w:hAnsi="Calibri" w:cs="Calibri"/>
           <w:sz w:val="32"/>
           <w:szCs w:val="32"/>
           <w:lang w:val="es-MX"/>
@@ -2516,7 +2284,7 @@
       </w:r>
       <w:r>
         <w:rPr>
-          <w:rFonts w:ascii="Calibri" w:hAnsi="Calibri" w:eastAsia="Calibri" w:cs="Calibri"/>
+          <w:rFonts w:ascii="Calibri" w:eastAsia="Calibri" w:hAnsi="Calibri" w:cs="Calibri"/>
           <w:sz w:val="32"/>
           <w:szCs w:val="32"/>
           <w:lang w:val="es-MX"/>
@@ -2525,7 +2293,7 @@
       </w:r>
       <w:r>
         <w:rPr>
-          <w:rFonts w:ascii="Calibri" w:hAnsi="Calibri" w:eastAsia="Calibri" w:cs="Calibri"/>
+          <w:rFonts w:ascii="Calibri" w:eastAsia="Calibri" w:hAnsi="Calibri" w:cs="Calibri"/>
           <w:sz w:val="32"/>
           <w:szCs w:val="32"/>
           <w:lang w:val="es-MX"/>
@@ -2534,7 +2302,7 @@
       </w:r>
       <w:r>
         <w:rPr>
-          <w:rFonts w:ascii="Calibri" w:hAnsi="Calibri" w:eastAsia="Calibri" w:cs="Calibri"/>
+          <w:rFonts w:ascii="Calibri" w:eastAsia="Calibri" w:hAnsi="Calibri" w:cs="Calibri"/>
           <w:sz w:val="32"/>
           <w:szCs w:val="32"/>
           <w:lang w:val="es-MX"/>
@@ -2543,7 +2311,7 @@
       </w:r>
       <w:r>
         <w:rPr>
-          <w:rFonts w:ascii="Calibri" w:hAnsi="Calibri" w:eastAsia="Calibri" w:cs="Calibri"/>
+          <w:rFonts w:ascii="Calibri" w:eastAsia="Calibri" w:hAnsi="Calibri" w:cs="Calibri"/>
           <w:sz w:val="32"/>
           <w:szCs w:val="32"/>
           <w:lang w:val="es-MX"/>
@@ -2552,7 +2320,7 @@
       </w:r>
       <w:r>
         <w:rPr>
-          <w:rFonts w:ascii="Calibri" w:hAnsi="Calibri" w:eastAsia="Calibri" w:cs="Calibri"/>
+          <w:rFonts w:ascii="Calibri" w:eastAsia="Calibri" w:hAnsi="Calibri" w:cs="Calibri"/>
           <w:sz w:val="32"/>
           <w:szCs w:val="32"/>
           <w:lang w:val="es-MX"/>
@@ -2561,7 +2329,7 @@
       </w:r>
       <w:r>
         <w:rPr>
-          <w:rFonts w:ascii="Calibri" w:hAnsi="Calibri" w:eastAsia="Calibri" w:cs="Calibri"/>
+          <w:rFonts w:ascii="Calibri" w:eastAsia="Calibri" w:hAnsi="Calibri" w:cs="Calibri"/>
           <w:sz w:val="32"/>
           <w:szCs w:val="32"/>
           <w:lang w:val="es-MX"/>
@@ -2570,7 +2338,7 @@
       </w:r>
       <w:r>
         <w:rPr>
-          <w:rFonts w:ascii="Calibri" w:hAnsi="Calibri" w:eastAsia="Calibri" w:cs="Calibri"/>
+          <w:rFonts w:ascii="Calibri" w:eastAsia="Calibri" w:hAnsi="Calibri" w:cs="Calibri"/>
           <w:sz w:val="32"/>
           <w:szCs w:val="32"/>
           <w:lang w:val="es-MX"/>
@@ -2579,7 +2347,7 @@
       </w:r>
       <w:r>
         <w:rPr>
-          <w:rFonts w:ascii="Calibri" w:hAnsi="Calibri" w:eastAsia="Calibri" w:cs="Calibri"/>
+          <w:rFonts w:ascii="Calibri" w:eastAsia="Calibri" w:hAnsi="Calibri" w:cs="Calibri"/>
           <w:sz w:val="32"/>
           <w:szCs w:val="32"/>
           <w:lang w:val="es-MX"/>
@@ -2588,7 +2356,7 @@
       </w:r>
       <w:r>
         <w:rPr>
-          <w:rFonts w:ascii="Calibri" w:hAnsi="Calibri" w:eastAsia="Calibri" w:cs="Calibri"/>
+          <w:rFonts w:ascii="Calibri" w:eastAsia="Calibri" w:hAnsi="Calibri" w:cs="Calibri"/>
           <w:sz w:val="32"/>
           <w:szCs w:val="32"/>
           <w:lang w:val="es-MX"/>
@@ -2607,7 +2375,7 @@
       </w:pPr>
       <w:r>
         <w:rPr>
-          <w:rFonts w:ascii="Calibri" w:hAnsi="Calibri" w:eastAsia="Calibri" w:cs="Calibri"/>
+          <w:rFonts w:ascii="Calibri" w:eastAsia="Calibri" w:hAnsi="Calibri" w:cs="Calibri"/>
           <w:sz w:val="32"/>
           <w:szCs w:val="32"/>
           <w:lang w:val="es-MX"/>
@@ -2616,7 +2384,7 @@
       </w:r>
       <w:r>
         <w:rPr>
-          <w:rFonts w:ascii="Calibri" w:hAnsi="Calibri" w:eastAsia="Calibri" w:cs="Calibri"/>
+          <w:rFonts w:ascii="Calibri" w:eastAsia="Calibri" w:hAnsi="Calibri" w:cs="Calibri"/>
           <w:sz w:val="32"/>
           <w:szCs w:val="32"/>
           <w:lang w:val="es-MX"/>
@@ -2625,7 +2393,7 @@
       </w:r>
       <w:r>
         <w:rPr>
-          <w:rFonts w:ascii="Calibri" w:hAnsi="Calibri" w:eastAsia="Calibri" w:cs="Calibri"/>
+          <w:rFonts w:ascii="Calibri" w:eastAsia="Calibri" w:hAnsi="Calibri" w:cs="Calibri"/>
           <w:sz w:val="32"/>
           <w:szCs w:val="32"/>
           <w:lang w:val="es-MX"/>
@@ -2634,7 +2402,7 @@
       </w:r>
       <w:r>
         <w:rPr>
-          <w:rFonts w:ascii="Calibri" w:hAnsi="Calibri" w:eastAsia="Calibri" w:cs="Calibri"/>
+          <w:rFonts w:ascii="Calibri" w:eastAsia="Calibri" w:hAnsi="Calibri" w:cs="Calibri"/>
           <w:sz w:val="32"/>
           <w:szCs w:val="32"/>
           <w:lang w:val="es-MX"/>
@@ -2643,7 +2411,7 @@
       </w:r>
       <w:r>
         <w:rPr>
-          <w:rFonts w:ascii="Calibri" w:hAnsi="Calibri" w:eastAsia="Calibri" w:cs="Calibri"/>
+          <w:rFonts w:ascii="Calibri" w:eastAsia="Calibri" w:hAnsi="Calibri" w:cs="Calibri"/>
           <w:sz w:val="32"/>
           <w:szCs w:val="32"/>
           <w:lang w:val="es-MX"/>
@@ -2652,7 +2420,7 @@
       </w:r>
       <w:r>
         <w:rPr>
-          <w:rFonts w:ascii="Calibri" w:hAnsi="Calibri" w:eastAsia="Calibri" w:cs="Calibri"/>
+          <w:rFonts w:ascii="Calibri" w:eastAsia="Calibri" w:hAnsi="Calibri" w:cs="Calibri"/>
           <w:sz w:val="32"/>
           <w:szCs w:val="32"/>
           <w:lang w:val="es-MX"/>
@@ -2661,7 +2429,7 @@
       </w:r>
       <w:r>
         <w:rPr>
-          <w:rFonts w:ascii="Calibri" w:hAnsi="Calibri" w:eastAsia="Calibri" w:cs="Calibri"/>
+          <w:rFonts w:ascii="Calibri" w:eastAsia="Calibri" w:hAnsi="Calibri" w:cs="Calibri"/>
           <w:sz w:val="32"/>
           <w:szCs w:val="32"/>
           <w:lang w:val="es-MX"/>
@@ -2670,7 +2438,7 @@
       </w:r>
       <w:r>
         <w:rPr>
-          <w:rFonts w:ascii="Calibri" w:hAnsi="Calibri" w:eastAsia="Calibri" w:cs="Calibri"/>
+          <w:rFonts w:ascii="Calibri" w:eastAsia="Calibri" w:hAnsi="Calibri" w:cs="Calibri"/>
           <w:sz w:val="32"/>
           <w:szCs w:val="32"/>
           <w:lang w:val="es-MX"/>
@@ -2679,7 +2447,7 @@
       </w:r>
       <w:r>
         <w:rPr>
-          <w:rFonts w:ascii="Calibri" w:hAnsi="Calibri" w:eastAsia="Calibri" w:cs="Calibri"/>
+          <w:rFonts w:ascii="Calibri" w:eastAsia="Calibri" w:hAnsi="Calibri" w:cs="Calibri"/>
           <w:sz w:val="32"/>
           <w:szCs w:val="32"/>
           <w:lang w:val="es-MX"/>
@@ -2688,7 +2456,7 @@
       </w:r>
       <w:r>
         <w:rPr>
-          <w:rFonts w:ascii="Calibri" w:hAnsi="Calibri" w:eastAsia="Calibri" w:cs="Calibri"/>
+          <w:rFonts w:ascii="Calibri" w:eastAsia="Calibri" w:hAnsi="Calibri" w:cs="Calibri"/>
           <w:sz w:val="32"/>
           <w:szCs w:val="32"/>
           <w:lang w:val="es-MX"/>
@@ -2697,7 +2465,7 @@
       </w:r>
       <w:r>
         <w:rPr>
-          <w:rFonts w:ascii="Calibri" w:hAnsi="Calibri" w:eastAsia="Calibri" w:cs="Calibri"/>
+          <w:rFonts w:ascii="Calibri" w:eastAsia="Calibri" w:hAnsi="Calibri" w:cs="Calibri"/>
           <w:sz w:val="32"/>
           <w:szCs w:val="32"/>
           <w:lang w:val="es-MX"/>
@@ -2709,15 +2477,15 @@
       <w:pPr>
         <w:jc w:val="both"/>
         <w:rPr>
-          <w:rFonts w:ascii="Calibri" w:hAnsi="Calibri" w:eastAsia="Calibri" w:cs="Calibri"/>
-          <w:sz w:val="32"/>
-          <w:szCs w:val="32"/>
-          <w:lang w:val="es-MX"/>
-        </w:rPr>
-      </w:pPr>
-      <w:r>
-        <w:rPr>
-          <w:rFonts w:ascii="Calibri" w:hAnsi="Calibri" w:eastAsia="Calibri" w:cs="Calibri"/>
+          <w:rFonts w:ascii="Calibri" w:eastAsia="Calibri" w:hAnsi="Calibri" w:cs="Calibri"/>
+          <w:sz w:val="32"/>
+          <w:szCs w:val="32"/>
+          <w:lang w:val="es-MX"/>
+        </w:rPr>
+      </w:pPr>
+      <w:r>
+        <w:rPr>
+          <w:rFonts w:ascii="Calibri" w:eastAsia="Calibri" w:hAnsi="Calibri" w:cs="Calibri"/>
           <w:sz w:val="32"/>
           <w:szCs w:val="32"/>
           <w:lang w:val="es-MX"/>
@@ -2726,7 +2494,7 @@
       </w:r>
       <w:r>
         <w:rPr>
-          <w:rFonts w:ascii="Calibri" w:hAnsi="Calibri" w:eastAsia="Calibri" w:cs="Calibri"/>
+          <w:rFonts w:ascii="Calibri" w:eastAsia="Calibri" w:hAnsi="Calibri" w:cs="Calibri"/>
           <w:sz w:val="32"/>
           <w:szCs w:val="32"/>
           <w:lang w:val="es-MX"/>
@@ -2735,7 +2503,7 @@
       </w:r>
       <w:r>
         <w:rPr>
-          <w:rFonts w:ascii="Calibri" w:hAnsi="Calibri" w:eastAsia="Calibri" w:cs="Calibri"/>
+          <w:rFonts w:ascii="Calibri" w:eastAsia="Calibri" w:hAnsi="Calibri" w:cs="Calibri"/>
           <w:sz w:val="32"/>
           <w:szCs w:val="32"/>
           <w:lang w:val="es-MX"/>
@@ -2744,7 +2512,7 @@
       </w:r>
       <w:r>
         <w:rPr>
-          <w:rFonts w:ascii="Calibri" w:hAnsi="Calibri" w:eastAsia="Calibri" w:cs="Calibri"/>
+          <w:rFonts w:ascii="Calibri" w:eastAsia="Calibri" w:hAnsi="Calibri" w:cs="Calibri"/>
           <w:sz w:val="32"/>
           <w:szCs w:val="32"/>
           <w:lang w:val="es-MX"/>
@@ -2753,7 +2521,7 @@
       </w:r>
       <w:r>
         <w:rPr>
-          <w:rFonts w:ascii="Calibri" w:hAnsi="Calibri" w:eastAsia="Calibri" w:cs="Calibri"/>
+          <w:rFonts w:ascii="Calibri" w:eastAsia="Calibri" w:hAnsi="Calibri" w:cs="Calibri"/>
           <w:sz w:val="32"/>
           <w:szCs w:val="32"/>
           <w:lang w:val="es-MX"/>
@@ -2762,7 +2530,7 @@
       </w:r>
       <w:r>
         <w:rPr>
-          <w:rFonts w:ascii="Calibri" w:hAnsi="Calibri" w:eastAsia="Calibri" w:cs="Calibri"/>
+          <w:rFonts w:ascii="Calibri" w:eastAsia="Calibri" w:hAnsi="Calibri" w:cs="Calibri"/>
           <w:sz w:val="32"/>
           <w:szCs w:val="32"/>
           <w:lang w:val="es-MX"/>
@@ -2771,7 +2539,7 @@
       </w:r>
       <w:r>
         <w:rPr>
-          <w:rFonts w:ascii="Calibri" w:hAnsi="Calibri" w:eastAsia="Calibri" w:cs="Calibri"/>
+          <w:rFonts w:ascii="Calibri" w:eastAsia="Calibri" w:hAnsi="Calibri" w:cs="Calibri"/>
           <w:sz w:val="32"/>
           <w:szCs w:val="32"/>
           <w:lang w:val="es-MX"/>
@@ -2780,7 +2548,7 @@
       </w:r>
       <w:r>
         <w:rPr>
-          <w:rFonts w:ascii="Calibri" w:hAnsi="Calibri" w:eastAsia="Calibri" w:cs="Calibri"/>
+          <w:rFonts w:ascii="Calibri" w:eastAsia="Calibri" w:hAnsi="Calibri" w:cs="Calibri"/>
           <w:sz w:val="32"/>
           <w:szCs w:val="32"/>
           <w:lang w:val="es-MX"/>
@@ -2789,7 +2557,7 @@
       </w:r>
       <w:r>
         <w:rPr>
-          <w:rFonts w:ascii="Calibri" w:hAnsi="Calibri" w:eastAsia="Calibri" w:cs="Calibri"/>
+          <w:rFonts w:ascii="Calibri" w:eastAsia="Calibri" w:hAnsi="Calibri" w:cs="Calibri"/>
           <w:sz w:val="32"/>
           <w:szCs w:val="32"/>
           <w:lang w:val="es-MX"/>
@@ -2798,7 +2566,7 @@
       </w:r>
       <w:r>
         <w:rPr>
-          <w:rFonts w:ascii="Calibri" w:hAnsi="Calibri" w:eastAsia="Calibri" w:cs="Calibri"/>
+          <w:rFonts w:ascii="Calibri" w:eastAsia="Calibri" w:hAnsi="Calibri" w:cs="Calibri"/>
           <w:sz w:val="32"/>
           <w:szCs w:val="32"/>
           <w:lang w:val="es-MX"/>
@@ -2810,15 +2578,15 @@
       <w:pPr>
         <w:jc w:val="both"/>
         <w:rPr>
-          <w:rFonts w:ascii="Calibri" w:hAnsi="Calibri" w:eastAsia="Calibri" w:cs="Calibri"/>
-          <w:sz w:val="32"/>
-          <w:szCs w:val="32"/>
-          <w:lang w:val="es-MX"/>
-        </w:rPr>
-      </w:pPr>
-      <w:r>
-        <w:rPr>
-          <w:rFonts w:ascii="Calibri" w:hAnsi="Calibri" w:eastAsia="Calibri" w:cs="Calibri"/>
+          <w:rFonts w:ascii="Calibri" w:eastAsia="Calibri" w:hAnsi="Calibri" w:cs="Calibri"/>
+          <w:sz w:val="32"/>
+          <w:szCs w:val="32"/>
+          <w:lang w:val="es-MX"/>
+        </w:rPr>
+      </w:pPr>
+      <w:r>
+        <w:rPr>
+          <w:rFonts w:ascii="Calibri" w:eastAsia="Calibri" w:hAnsi="Calibri" w:cs="Calibri"/>
           <w:sz w:val="32"/>
           <w:szCs w:val="32"/>
           <w:lang w:val="es-MX"/>
@@ -2827,7 +2595,7 @@
       </w:r>
       <w:r>
         <w:rPr>
-          <w:rFonts w:ascii="Calibri" w:hAnsi="Calibri" w:eastAsia="Calibri" w:cs="Calibri"/>
+          <w:rFonts w:ascii="Calibri" w:eastAsia="Calibri" w:hAnsi="Calibri" w:cs="Calibri"/>
           <w:sz w:val="32"/>
           <w:szCs w:val="32"/>
           <w:lang w:val="es-MX"/>
@@ -2836,7 +2604,7 @@
       </w:r>
       <w:r>
         <w:rPr>
-          <w:rFonts w:ascii="Calibri" w:hAnsi="Calibri" w:eastAsia="Calibri" w:cs="Calibri"/>
+          <w:rFonts w:ascii="Calibri" w:eastAsia="Calibri" w:hAnsi="Calibri" w:cs="Calibri"/>
           <w:sz w:val="32"/>
           <w:szCs w:val="32"/>
           <w:lang w:val="es-MX"/>
@@ -2845,7 +2613,7 @@
       </w:r>
       <w:r>
         <w:rPr>
-          <w:rFonts w:ascii="Calibri" w:hAnsi="Calibri" w:eastAsia="Calibri" w:cs="Calibri"/>
+          <w:rFonts w:ascii="Calibri" w:eastAsia="Calibri" w:hAnsi="Calibri" w:cs="Calibri"/>
           <w:sz w:val="32"/>
           <w:szCs w:val="32"/>
           <w:lang w:val="es-MX"/>
@@ -2854,7 +2622,7 @@
       </w:r>
       <w:r>
         <w:rPr>
-          <w:rFonts w:ascii="Calibri" w:hAnsi="Calibri" w:eastAsia="Calibri" w:cs="Calibri"/>
+          <w:rFonts w:ascii="Calibri" w:eastAsia="Calibri" w:hAnsi="Calibri" w:cs="Calibri"/>
           <w:sz w:val="32"/>
           <w:szCs w:val="32"/>
           <w:lang w:val="es-MX"/>
@@ -2863,7 +2631,7 @@
       </w:r>
       <w:r>
         <w:rPr>
-          <w:rFonts w:ascii="Calibri" w:hAnsi="Calibri" w:eastAsia="Calibri" w:cs="Calibri"/>
+          <w:rFonts w:ascii="Calibri" w:eastAsia="Calibri" w:hAnsi="Calibri" w:cs="Calibri"/>
           <w:sz w:val="32"/>
           <w:szCs w:val="32"/>
           <w:lang w:val="es-MX"/>
@@ -2872,7 +2640,7 @@
       </w:r>
       <w:r>
         <w:rPr>
-          <w:rFonts w:ascii="Calibri" w:hAnsi="Calibri" w:eastAsia="Calibri" w:cs="Calibri"/>
+          <w:rFonts w:ascii="Calibri" w:eastAsia="Calibri" w:hAnsi="Calibri" w:cs="Calibri"/>
           <w:sz w:val="32"/>
           <w:szCs w:val="32"/>
           <w:lang w:val="es-MX"/>
@@ -2883,17 +2651,17 @@
     <w:p>
       <w:pPr>
         <w:rPr>
-          <w:rFonts w:ascii="Calibri" w:hAnsi="Calibri" w:eastAsia="Calibri" w:cs="Calibri"/>
-          <w:sz w:val="32"/>
-          <w:szCs w:val="32"/>
-          <w:lang w:val="es-MX"/>
-        </w:rPr>
-      </w:pPr>
-    </w:p>
-    <w:p>
-      <w:pPr>
-        <w:rPr>
-          <w:rFonts w:ascii="Calibri" w:hAnsi="Calibri" w:eastAsia="Calibri" w:cs="Calibri"/>
+          <w:rFonts w:ascii="Calibri" w:eastAsia="Calibri" w:hAnsi="Calibri" w:cs="Calibri"/>
+          <w:sz w:val="32"/>
+          <w:szCs w:val="32"/>
+          <w:lang w:val="es-MX"/>
+        </w:rPr>
+      </w:pPr>
+    </w:p>
+    <w:p>
+      <w:pPr>
+        <w:rPr>
+          <w:rFonts w:ascii="Calibri" w:eastAsia="Calibri" w:hAnsi="Calibri" w:cs="Calibri"/>
           <w:sz w:val="32"/>
           <w:szCs w:val="32"/>
           <w:lang w:val="es-MX"/>
@@ -2934,6 +2702,7 @@
           <w:szCs w:val="32"/>
           <w:lang w:val="es-MX"/>
         </w:rPr>
+        <w:lastRenderedPageBreak/>
         <w:t>Propósitos</w:t>
       </w:r>
     </w:p>
@@ -2961,7 +2730,7 @@
       <w:pPr>
         <w:jc w:val="both"/>
         <w:rPr>
-          <w:rFonts w:ascii="Calibri" w:hAnsi="Calibri" w:eastAsia="Calibri" w:cs="Calibri"/>
+          <w:rFonts w:ascii="Calibri" w:eastAsia="Calibri" w:hAnsi="Calibri" w:cs="Calibri"/>
           <w:sz w:val="36"/>
           <w:szCs w:val="36"/>
           <w:lang w:val="es-MX"/>
@@ -2969,7 +2738,7 @@
       </w:pPr>
       <w:r>
         <w:rPr>
-          <w:rFonts w:ascii="Calibri" w:hAnsi="Calibri" w:eastAsia="Calibri" w:cs="Calibri"/>
+          <w:rFonts w:ascii="Calibri" w:eastAsia="Calibri" w:hAnsi="Calibri" w:cs="Calibri"/>
           <w:sz w:val="32"/>
           <w:szCs w:val="32"/>
           <w:lang w:val="es-MX"/>
@@ -2978,7 +2747,7 @@
       </w:r>
       <w:r>
         <w:rPr>
-          <w:rFonts w:ascii="Calibri" w:hAnsi="Calibri" w:eastAsia="Calibri" w:cs="Calibri"/>
+          <w:rFonts w:ascii="Calibri" w:eastAsia="Calibri" w:hAnsi="Calibri" w:cs="Calibri"/>
           <w:sz w:val="32"/>
           <w:szCs w:val="32"/>
           <w:lang w:val="es-MX"/>
@@ -2987,7 +2756,7 @@
       </w:r>
       <w:r>
         <w:rPr>
-          <w:rFonts w:ascii="Calibri" w:hAnsi="Calibri" w:eastAsia="Calibri" w:cs="Calibri"/>
+          <w:rFonts w:ascii="Calibri" w:eastAsia="Calibri" w:hAnsi="Calibri" w:cs="Calibri"/>
           <w:sz w:val="32"/>
           <w:szCs w:val="32"/>
           <w:lang w:val="es-MX"/>
@@ -3025,15 +2794,15 @@
         <w:spacing w:after="0"/>
         <w:jc w:val="both"/>
         <w:rPr>
-          <w:rFonts w:ascii="Calibri" w:hAnsi="Calibri" w:eastAsia="Calibri" w:cs="Calibri"/>
-          <w:sz w:val="32"/>
-          <w:szCs w:val="32"/>
-          <w:lang w:val="es-MX"/>
-        </w:rPr>
-      </w:pPr>
-      <w:r>
-        <w:rPr>
-          <w:rFonts w:ascii="Calibri" w:hAnsi="Calibri" w:eastAsia="Calibri" w:cs="Calibri"/>
+          <w:rFonts w:ascii="Calibri" w:eastAsia="Calibri" w:hAnsi="Calibri" w:cs="Calibri"/>
+          <w:sz w:val="32"/>
+          <w:szCs w:val="32"/>
+          <w:lang w:val="es-MX"/>
+        </w:rPr>
+      </w:pPr>
+      <w:r>
+        <w:rPr>
+          <w:rFonts w:ascii="Calibri" w:eastAsia="Calibri" w:hAnsi="Calibri" w:cs="Calibri"/>
           <w:sz w:val="32"/>
           <w:szCs w:val="32"/>
           <w:lang w:val="es-MX"/>
@@ -3051,15 +2820,15 @@
         <w:spacing w:after="0"/>
         <w:jc w:val="both"/>
         <w:rPr>
-          <w:rFonts w:ascii="Calibri" w:hAnsi="Calibri" w:eastAsia="Calibri" w:cs="Calibri"/>
-          <w:sz w:val="32"/>
-          <w:szCs w:val="32"/>
-          <w:lang w:val="es-MX"/>
-        </w:rPr>
-      </w:pPr>
-      <w:r>
-        <w:rPr>
-          <w:rFonts w:ascii="Calibri" w:hAnsi="Calibri" w:eastAsia="Calibri" w:cs="Calibri"/>
+          <w:rFonts w:ascii="Calibri" w:eastAsia="Calibri" w:hAnsi="Calibri" w:cs="Calibri"/>
+          <w:sz w:val="32"/>
+          <w:szCs w:val="32"/>
+          <w:lang w:val="es-MX"/>
+        </w:rPr>
+      </w:pPr>
+      <w:r>
+        <w:rPr>
+          <w:rFonts w:ascii="Calibri" w:eastAsia="Calibri" w:hAnsi="Calibri" w:cs="Calibri"/>
           <w:sz w:val="32"/>
           <w:szCs w:val="32"/>
           <w:lang w:val="es-MX"/>
@@ -3077,15 +2846,15 @@
         <w:spacing w:after="0"/>
         <w:jc w:val="both"/>
         <w:rPr>
-          <w:rFonts w:ascii="Calibri" w:hAnsi="Calibri" w:eastAsia="Calibri" w:cs="Calibri"/>
-          <w:sz w:val="32"/>
-          <w:szCs w:val="32"/>
-          <w:lang w:val="es-MX"/>
-        </w:rPr>
-      </w:pPr>
-      <w:r>
-        <w:rPr>
-          <w:rFonts w:ascii="Calibri" w:hAnsi="Calibri" w:eastAsia="Calibri" w:cs="Calibri"/>
+          <w:rFonts w:ascii="Calibri" w:eastAsia="Calibri" w:hAnsi="Calibri" w:cs="Calibri"/>
+          <w:sz w:val="32"/>
+          <w:szCs w:val="32"/>
+          <w:lang w:val="es-MX"/>
+        </w:rPr>
+      </w:pPr>
+      <w:r>
+        <w:rPr>
+          <w:rFonts w:ascii="Calibri" w:eastAsia="Calibri" w:hAnsi="Calibri" w:cs="Calibri"/>
           <w:sz w:val="32"/>
           <w:szCs w:val="32"/>
           <w:lang w:val="es-MX"/>
@@ -3103,15 +2872,15 @@
         <w:spacing w:after="0"/>
         <w:jc w:val="both"/>
         <w:rPr>
-          <w:rFonts w:ascii="Calibri" w:hAnsi="Calibri" w:eastAsia="Calibri" w:cs="Calibri"/>
-          <w:sz w:val="32"/>
-          <w:szCs w:val="32"/>
-          <w:lang w:val="es-MX"/>
-        </w:rPr>
-      </w:pPr>
-      <w:r>
-        <w:rPr>
-          <w:rFonts w:ascii="Calibri" w:hAnsi="Calibri" w:eastAsia="Calibri" w:cs="Calibri"/>
+          <w:rFonts w:ascii="Calibri" w:eastAsia="Calibri" w:hAnsi="Calibri" w:cs="Calibri"/>
+          <w:sz w:val="32"/>
+          <w:szCs w:val="32"/>
+          <w:lang w:val="es-MX"/>
+        </w:rPr>
+      </w:pPr>
+      <w:r>
+        <w:rPr>
+          <w:rFonts w:ascii="Calibri" w:eastAsia="Calibri" w:hAnsi="Calibri" w:cs="Calibri"/>
           <w:sz w:val="32"/>
           <w:szCs w:val="32"/>
           <w:lang w:val="es-MX"/>
@@ -3123,7 +2892,7 @@
       <w:pPr>
         <w:spacing w:after="0"/>
         <w:rPr>
-          <w:rFonts w:ascii="Calibri" w:hAnsi="Calibri" w:eastAsia="Calibri" w:cs="Calibri"/>
+          <w:rFonts w:ascii="Calibri" w:eastAsia="Calibri" w:hAnsi="Calibri" w:cs="Calibri"/>
           <w:sz w:val="32"/>
           <w:szCs w:val="32"/>
           <w:lang w:val="es-MX"/>
@@ -3134,7 +2903,7 @@
       <w:pPr>
         <w:spacing w:after="0"/>
         <w:rPr>
-          <w:rFonts w:ascii="Calibri" w:hAnsi="Calibri" w:eastAsia="Calibri" w:cs="Calibri"/>
+          <w:rFonts w:ascii="Calibri" w:eastAsia="Calibri" w:hAnsi="Calibri" w:cs="Calibri"/>
           <w:sz w:val="32"/>
           <w:szCs w:val="32"/>
           <w:lang w:val="es-MX"/>
@@ -3145,7 +2914,7 @@
       <w:pPr>
         <w:spacing w:after="0"/>
         <w:rPr>
-          <w:rFonts w:ascii="Calibri" w:hAnsi="Calibri" w:eastAsia="Calibri" w:cs="Calibri"/>
+          <w:rFonts w:ascii="Calibri" w:eastAsia="Calibri" w:hAnsi="Calibri" w:cs="Calibri"/>
           <w:sz w:val="32"/>
           <w:szCs w:val="32"/>
           <w:lang w:val="es-MX"/>
@@ -3156,7 +2925,7 @@
       <w:pPr>
         <w:spacing w:after="0"/>
         <w:rPr>
-          <w:rFonts w:ascii="Calibri" w:hAnsi="Calibri" w:eastAsia="Calibri" w:cs="Calibri"/>
+          <w:rFonts w:ascii="Calibri" w:eastAsia="Calibri" w:hAnsi="Calibri" w:cs="Calibri"/>
           <w:sz w:val="32"/>
           <w:szCs w:val="32"/>
           <w:lang w:val="es-MX"/>
@@ -3167,7 +2936,7 @@
       <w:pPr>
         <w:spacing w:after="0"/>
         <w:rPr>
-          <w:rFonts w:ascii="Calibri" w:hAnsi="Calibri" w:eastAsia="Calibri" w:cs="Calibri"/>
+          <w:rFonts w:ascii="Calibri" w:eastAsia="Calibri" w:hAnsi="Calibri" w:cs="Calibri"/>
           <w:sz w:val="32"/>
           <w:szCs w:val="32"/>
           <w:lang w:val="es-MX"/>
@@ -3178,7 +2947,7 @@
       <w:pPr>
         <w:spacing w:after="0"/>
         <w:rPr>
-          <w:rFonts w:ascii="Calibri" w:hAnsi="Calibri" w:eastAsia="Calibri" w:cs="Calibri"/>
+          <w:rFonts w:ascii="Calibri" w:eastAsia="Calibri" w:hAnsi="Calibri" w:cs="Calibri"/>
           <w:sz w:val="32"/>
           <w:szCs w:val="32"/>
           <w:lang w:val="es-MX"/>
@@ -3189,7 +2958,7 @@
       <w:pPr>
         <w:spacing w:after="0"/>
         <w:rPr>
-          <w:rFonts w:ascii="Calibri" w:hAnsi="Calibri" w:eastAsia="Calibri" w:cs="Calibri"/>
+          <w:rFonts w:ascii="Calibri" w:eastAsia="Calibri" w:hAnsi="Calibri" w:cs="Calibri"/>
           <w:sz w:val="32"/>
           <w:szCs w:val="32"/>
           <w:lang w:val="es-MX"/>
@@ -3200,7 +2969,7 @@
       <w:pPr>
         <w:spacing w:after="0"/>
         <w:rPr>
-          <w:rFonts w:ascii="Calibri" w:hAnsi="Calibri" w:eastAsia="Calibri" w:cs="Calibri"/>
+          <w:rFonts w:ascii="Calibri" w:eastAsia="Calibri" w:hAnsi="Calibri" w:cs="Calibri"/>
           <w:sz w:val="32"/>
           <w:szCs w:val="32"/>
           <w:lang w:val="es-MX"/>
@@ -3211,7 +2980,7 @@
       <w:pPr>
         <w:spacing w:after="0"/>
         <w:rPr>
-          <w:rFonts w:ascii="Calibri" w:hAnsi="Calibri" w:eastAsia="Calibri" w:cs="Calibri"/>
+          <w:rFonts w:ascii="Calibri" w:eastAsia="Calibri" w:hAnsi="Calibri" w:cs="Calibri"/>
           <w:sz w:val="32"/>
           <w:szCs w:val="32"/>
           <w:lang w:val="es-MX"/>
@@ -3222,7 +2991,7 @@
       <w:pPr>
         <w:spacing w:after="0"/>
         <w:rPr>
-          <w:rFonts w:ascii="Calibri" w:hAnsi="Calibri" w:eastAsia="Calibri" w:cs="Calibri"/>
+          <w:rFonts w:ascii="Calibri" w:eastAsia="Calibri" w:hAnsi="Calibri" w:cs="Calibri"/>
           <w:sz w:val="32"/>
           <w:szCs w:val="32"/>
           <w:lang w:val="es-MX"/>
@@ -3233,7 +3002,7 @@
       <w:pPr>
         <w:spacing w:after="0"/>
         <w:rPr>
-          <w:rFonts w:ascii="Calibri" w:hAnsi="Calibri" w:eastAsia="Calibri" w:cs="Calibri"/>
+          <w:rFonts w:ascii="Calibri" w:eastAsia="Calibri" w:hAnsi="Calibri" w:cs="Calibri"/>
           <w:sz w:val="32"/>
           <w:szCs w:val="32"/>
           <w:lang w:val="es-MX"/>
@@ -3244,7 +3013,7 @@
       <w:pPr>
         <w:spacing w:after="0"/>
         <w:rPr>
-          <w:rFonts w:ascii="Calibri" w:hAnsi="Calibri" w:eastAsia="Calibri" w:cs="Calibri"/>
+          <w:rFonts w:ascii="Calibri" w:eastAsia="Calibri" w:hAnsi="Calibri" w:cs="Calibri"/>
           <w:sz w:val="32"/>
           <w:szCs w:val="32"/>
           <w:lang w:val="es-MX"/>
@@ -3276,7 +3045,7 @@
       <w:pPr>
         <w:jc w:val="both"/>
         <w:rPr>
-          <w:rFonts w:ascii="Calibri" w:hAnsi="Calibri" w:eastAsia="Calibri" w:cs="Calibri"/>
+          <w:rFonts w:ascii="Calibri" w:eastAsia="Calibri" w:hAnsi="Calibri" w:cs="Calibri"/>
           <w:sz w:val="32"/>
           <w:szCs w:val="32"/>
           <w:lang w:val="es-MX"/>
@@ -3290,6 +3059,7 @@
           <w:szCs w:val="32"/>
           <w:lang w:val="es-MX"/>
         </w:rPr>
+        <w:lastRenderedPageBreak/>
         <w:t xml:space="preserve">Propuesta de </w:t>
       </w:r>
       <w:r>
@@ -3307,10 +3077,13 @@
       <w:pPr>
         <w:spacing w:before="240" w:after="240"/>
         <w:jc w:val="both"/>
-      </w:pPr>
-      <w:r>
-        <w:rPr>
-          <w:rFonts w:ascii="Calibri" w:hAnsi="Calibri" w:eastAsia="Calibri" w:cs="Calibri"/>
+        <w:rPr>
+          <w:lang w:val="es-MX"/>
+        </w:rPr>
+      </w:pPr>
+      <w:r>
+        <w:rPr>
+          <w:rFonts w:ascii="Calibri" w:eastAsia="Calibri" w:hAnsi="Calibri" w:cs="Calibri"/>
           <w:sz w:val="32"/>
           <w:szCs w:val="32"/>
           <w:lang w:val="es-MX"/>
@@ -3319,7 +3092,7 @@
       </w:r>
       <w:r>
         <w:rPr>
-          <w:rFonts w:ascii="Calibri" w:hAnsi="Calibri" w:eastAsia="Calibri" w:cs="Calibri"/>
+          <w:rFonts w:ascii="Calibri" w:eastAsia="Calibri" w:hAnsi="Calibri" w:cs="Calibri"/>
           <w:sz w:val="32"/>
           <w:szCs w:val="32"/>
           <w:lang w:val="es-MX"/>
@@ -3328,7 +3101,7 @@
       </w:r>
       <w:r>
         <w:rPr>
-          <w:rFonts w:ascii="Calibri" w:hAnsi="Calibri" w:eastAsia="Calibri" w:cs="Calibri"/>
+          <w:rFonts w:ascii="Calibri" w:eastAsia="Calibri" w:hAnsi="Calibri" w:cs="Calibri"/>
           <w:sz w:val="32"/>
           <w:szCs w:val="32"/>
           <w:lang w:val="es-MX"/>
@@ -3340,10 +3113,13 @@
       <w:pPr>
         <w:spacing w:before="240" w:after="240"/>
         <w:jc w:val="both"/>
-      </w:pPr>
-      <w:r>
-        <w:rPr>
-          <w:rFonts w:ascii="Calibri" w:hAnsi="Calibri" w:eastAsia="Calibri" w:cs="Calibri"/>
+        <w:rPr>
+          <w:lang w:val="es-MX"/>
+        </w:rPr>
+      </w:pPr>
+      <w:r>
+        <w:rPr>
+          <w:rFonts w:ascii="Calibri" w:eastAsia="Calibri" w:hAnsi="Calibri" w:cs="Calibri"/>
           <w:sz w:val="32"/>
           <w:szCs w:val="32"/>
           <w:lang w:val="es-MX"/>
@@ -3352,7 +3128,7 @@
       </w:r>
       <w:r>
         <w:rPr>
-          <w:rFonts w:ascii="Calibri" w:hAnsi="Calibri" w:eastAsia="Calibri" w:cs="Calibri"/>
+          <w:rFonts w:ascii="Calibri" w:eastAsia="Calibri" w:hAnsi="Calibri" w:cs="Calibri"/>
           <w:sz w:val="32"/>
           <w:szCs w:val="32"/>
           <w:lang w:val="es-MX"/>
@@ -3361,7 +3137,7 @@
       </w:r>
       <w:r>
         <w:rPr>
-          <w:rFonts w:ascii="Calibri" w:hAnsi="Calibri" w:eastAsia="Calibri" w:cs="Calibri"/>
+          <w:rFonts w:ascii="Calibri" w:eastAsia="Calibri" w:hAnsi="Calibri" w:cs="Calibri"/>
           <w:sz w:val="32"/>
           <w:szCs w:val="32"/>
           <w:lang w:val="es-MX"/>
@@ -3370,7 +3146,7 @@
       </w:r>
       <w:r>
         <w:rPr>
-          <w:rFonts w:ascii="Calibri" w:hAnsi="Calibri" w:eastAsia="Calibri" w:cs="Calibri"/>
+          <w:rFonts w:ascii="Calibri" w:eastAsia="Calibri" w:hAnsi="Calibri" w:cs="Calibri"/>
           <w:sz w:val="32"/>
           <w:szCs w:val="32"/>
           <w:lang w:val="es-MX"/>
@@ -3379,7 +3155,7 @@
       </w:r>
       <w:r>
         <w:rPr>
-          <w:rFonts w:ascii="Calibri" w:hAnsi="Calibri" w:eastAsia="Calibri" w:cs="Calibri"/>
+          <w:rFonts w:ascii="Calibri" w:eastAsia="Calibri" w:hAnsi="Calibri" w:cs="Calibri"/>
           <w:sz w:val="32"/>
           <w:szCs w:val="32"/>
           <w:lang w:val="es-MX"/>
@@ -3388,7 +3164,7 @@
       </w:r>
       <w:r>
         <w:rPr>
-          <w:rFonts w:ascii="Calibri" w:hAnsi="Calibri" w:eastAsia="Calibri" w:cs="Calibri"/>
+          <w:rFonts w:ascii="Calibri" w:eastAsia="Calibri" w:hAnsi="Calibri" w:cs="Calibri"/>
           <w:sz w:val="32"/>
           <w:szCs w:val="32"/>
           <w:lang w:val="es-MX"/>
@@ -3397,7 +3173,7 @@
       </w:r>
       <w:r>
         <w:rPr>
-          <w:rFonts w:ascii="Calibri" w:hAnsi="Calibri" w:eastAsia="Calibri" w:cs="Calibri"/>
+          <w:rFonts w:ascii="Calibri" w:eastAsia="Calibri" w:hAnsi="Calibri" w:cs="Calibri"/>
           <w:sz w:val="32"/>
           <w:szCs w:val="32"/>
           <w:lang w:val="es-MX"/>
@@ -3409,10 +3185,13 @@
       <w:pPr>
         <w:spacing w:after="0"/>
         <w:jc w:val="both"/>
-      </w:pPr>
-      <w:r>
-        <w:rPr>
-          <w:rFonts w:ascii="Calibri" w:hAnsi="Calibri" w:eastAsia="Calibri" w:cs="Calibri"/>
+        <w:rPr>
+          <w:lang w:val="es-MX"/>
+        </w:rPr>
+      </w:pPr>
+      <w:r>
+        <w:rPr>
+          <w:rFonts w:ascii="Calibri" w:eastAsia="Calibri" w:hAnsi="Calibri" w:cs="Calibri"/>
           <w:sz w:val="32"/>
           <w:szCs w:val="32"/>
           <w:lang w:val="es-MX"/>
@@ -3421,7 +3200,7 @@
       </w:r>
       <w:r>
         <w:rPr>
-          <w:rFonts w:ascii="Calibri" w:hAnsi="Calibri" w:eastAsia="Calibri" w:cs="Calibri"/>
+          <w:rFonts w:ascii="Calibri" w:eastAsia="Calibri" w:hAnsi="Calibri" w:cs="Calibri"/>
           <w:sz w:val="32"/>
           <w:szCs w:val="32"/>
           <w:lang w:val="es-MX"/>
@@ -3430,7 +3209,7 @@
       </w:r>
       <w:r>
         <w:rPr>
-          <w:rFonts w:ascii="Calibri" w:hAnsi="Calibri" w:eastAsia="Calibri" w:cs="Calibri"/>
+          <w:rFonts w:ascii="Calibri" w:eastAsia="Calibri" w:hAnsi="Calibri" w:cs="Calibri"/>
           <w:sz w:val="32"/>
           <w:szCs w:val="32"/>
           <w:lang w:val="es-MX"/>
@@ -3439,7 +3218,7 @@
       </w:r>
       <w:r>
         <w:rPr>
-          <w:rFonts w:ascii="Calibri" w:hAnsi="Calibri" w:eastAsia="Calibri" w:cs="Calibri"/>
+          <w:rFonts w:ascii="Calibri" w:eastAsia="Calibri" w:hAnsi="Calibri" w:cs="Calibri"/>
           <w:sz w:val="32"/>
           <w:szCs w:val="32"/>
           <w:lang w:val="es-MX"/>
@@ -3448,7 +3227,7 @@
       </w:r>
       <w:r>
         <w:rPr>
-          <w:rFonts w:ascii="Calibri" w:hAnsi="Calibri" w:eastAsia="Calibri" w:cs="Calibri"/>
+          <w:rFonts w:ascii="Calibri" w:eastAsia="Calibri" w:hAnsi="Calibri" w:cs="Calibri"/>
           <w:sz w:val="32"/>
           <w:szCs w:val="32"/>
           <w:lang w:val="es-MX"/>
@@ -3457,7 +3236,7 @@
       </w:r>
       <w:r>
         <w:rPr>
-          <w:rFonts w:ascii="Calibri" w:hAnsi="Calibri" w:eastAsia="Calibri" w:cs="Calibri"/>
+          <w:rFonts w:ascii="Calibri" w:eastAsia="Calibri" w:hAnsi="Calibri" w:cs="Calibri"/>
           <w:sz w:val="32"/>
           <w:szCs w:val="32"/>
           <w:lang w:val="es-MX"/>
@@ -3466,7 +3245,7 @@
       </w:r>
       <w:r>
         <w:rPr>
-          <w:rFonts w:ascii="Calibri" w:hAnsi="Calibri" w:eastAsia="Calibri" w:cs="Calibri"/>
+          <w:rFonts w:ascii="Calibri" w:eastAsia="Calibri" w:hAnsi="Calibri" w:cs="Calibri"/>
           <w:sz w:val="32"/>
           <w:szCs w:val="32"/>
           <w:lang w:val="es-MX"/>
@@ -3475,7 +3254,7 @@
       </w:r>
       <w:r>
         <w:rPr>
-          <w:rFonts w:ascii="Calibri" w:hAnsi="Calibri" w:eastAsia="Calibri" w:cs="Calibri"/>
+          <w:rFonts w:ascii="Calibri" w:eastAsia="Calibri" w:hAnsi="Calibri" w:cs="Calibri"/>
           <w:sz w:val="32"/>
           <w:szCs w:val="32"/>
           <w:lang w:val="es-MX"/>
@@ -3484,7 +3263,7 @@
       </w:r>
       <w:r>
         <w:rPr>
-          <w:rFonts w:ascii="Calibri" w:hAnsi="Calibri" w:eastAsia="Calibri" w:cs="Calibri"/>
+          <w:rFonts w:ascii="Calibri" w:eastAsia="Calibri" w:hAnsi="Calibri" w:cs="Calibri"/>
           <w:sz w:val="32"/>
           <w:szCs w:val="32"/>
           <w:lang w:val="es-MX"/>
@@ -3493,7 +3272,7 @@
       </w:r>
       <w:r>
         <w:rPr>
-          <w:rFonts w:ascii="Calibri" w:hAnsi="Calibri" w:eastAsia="Calibri" w:cs="Calibri"/>
+          <w:rFonts w:ascii="Calibri" w:eastAsia="Calibri" w:hAnsi="Calibri" w:cs="Calibri"/>
           <w:sz w:val="32"/>
           <w:szCs w:val="32"/>
           <w:lang w:val="es-MX"/>
@@ -3502,7 +3281,7 @@
       </w:r>
       <w:r>
         <w:rPr>
-          <w:rFonts w:ascii="Calibri" w:hAnsi="Calibri" w:eastAsia="Calibri" w:cs="Calibri"/>
+          <w:rFonts w:ascii="Calibri" w:eastAsia="Calibri" w:hAnsi="Calibri" w:cs="Calibri"/>
           <w:sz w:val="32"/>
           <w:szCs w:val="32"/>
           <w:lang w:val="es-MX"/>
@@ -3514,7 +3293,7 @@
       <w:pPr>
         <w:spacing w:after="0"/>
         <w:rPr>
-          <w:rFonts w:ascii="Calibri" w:hAnsi="Calibri" w:eastAsia="Calibri" w:cs="Calibri"/>
+          <w:rFonts w:ascii="Calibri" w:eastAsia="Calibri" w:hAnsi="Calibri" w:cs="Calibri"/>
           <w:sz w:val="32"/>
           <w:szCs w:val="32"/>
           <w:lang w:val="es-MX"/>
@@ -3525,25 +3304,25 @@
       <w:pPr>
         <w:spacing w:after="0"/>
         <w:rPr>
-          <w:rFonts w:ascii="Calibri" w:hAnsi="Calibri" w:eastAsia="Calibri" w:cs="Calibri"/>
-          <w:sz w:val="32"/>
-          <w:szCs w:val="32"/>
-          <w:lang w:val="es-MX"/>
-        </w:rPr>
-      </w:pPr>
-    </w:p>
-    <w:p>
-      <w:pPr>
-        <w:rPr>
-          <w:rFonts w:ascii="Calibri" w:hAnsi="Calibri" w:eastAsia="Calibri" w:cs="Calibri"/>
-          <w:sz w:val="32"/>
-          <w:szCs w:val="32"/>
-          <w:lang w:val="es-MX"/>
-        </w:rPr>
-      </w:pPr>
-      <w:r>
-        <w:rPr>
-          <w:rFonts w:ascii="Calibri" w:hAnsi="Calibri" w:eastAsia="Calibri" w:cs="Calibri"/>
+          <w:rFonts w:ascii="Calibri" w:eastAsia="Calibri" w:hAnsi="Calibri" w:cs="Calibri"/>
+          <w:sz w:val="32"/>
+          <w:szCs w:val="32"/>
+          <w:lang w:val="es-MX"/>
+        </w:rPr>
+      </w:pPr>
+    </w:p>
+    <w:p>
+      <w:pPr>
+        <w:rPr>
+          <w:rFonts w:ascii="Calibri" w:eastAsia="Calibri" w:hAnsi="Calibri" w:cs="Calibri"/>
+          <w:sz w:val="32"/>
+          <w:szCs w:val="32"/>
+          <w:lang w:val="es-MX"/>
+        </w:rPr>
+      </w:pPr>
+      <w:r>
+        <w:rPr>
+          <w:rFonts w:ascii="Calibri" w:eastAsia="Calibri" w:hAnsi="Calibri" w:cs="Calibri"/>
           <w:sz w:val="32"/>
           <w:szCs w:val="32"/>
           <w:lang w:val="es-MX"/>
@@ -3555,19 +3334,21 @@
       <w:pPr>
         <w:spacing w:after="0"/>
         <w:rPr>
-          <w:rFonts w:ascii="Calibri" w:hAnsi="Calibri" w:eastAsia="Calibri" w:cs="Calibri"/>
-          <w:sz w:val="32"/>
-          <w:szCs w:val="32"/>
-          <w:lang w:val="es-MX"/>
-        </w:rPr>
-      </w:pPr>
-      <w:r>
-        <w:rPr>
-          <w:rFonts w:ascii="Calibri" w:hAnsi="Calibri" w:eastAsia="Calibri" w:cs="Calibri"/>
-          <w:sz w:val="32"/>
-          <w:szCs w:val="32"/>
-          <w:lang w:val="es-MX"/>
-        </w:rPr>
+          <w:rFonts w:ascii="Calibri" w:eastAsia="Calibri" w:hAnsi="Calibri" w:cs="Calibri"/>
+          <w:sz w:val="32"/>
+          <w:szCs w:val="32"/>
+          <w:lang w:val="es-MX"/>
+        </w:rPr>
+      </w:pPr>
+      <w:r>
+        <w:rPr>
+          <w:rFonts w:ascii="Calibri" w:eastAsia="Calibri" w:hAnsi="Calibri" w:cs="Calibri"/>
+          <w:noProof/>
+          <w:sz w:val="32"/>
+          <w:szCs w:val="32"/>
+          <w:lang w:val="es-MX"/>
+        </w:rPr>
+        <w:lastRenderedPageBreak/>
         <w:drawing>
           <wp:inline distT="0" distB="0" distL="0" distR="0" wp14:anchorId="0D6E3487" wp14:editId="6F660900">
             <wp:extent cx="5943600" cy="7177405"/>
@@ -3622,7 +3403,7 @@
       <w:pPr>
         <w:spacing w:after="0"/>
         <w:rPr>
-          <w:rFonts w:ascii="Calibri" w:hAnsi="Calibri" w:eastAsia="Calibri" w:cs="Calibri"/>
+          <w:rFonts w:ascii="Calibri" w:eastAsia="Calibri" w:hAnsi="Calibri" w:cs="Calibri"/>
           <w:sz w:val="32"/>
           <w:szCs w:val="32"/>
           <w:lang w:val="es-MX"/>
@@ -3633,7 +3414,7 @@
       <w:pPr>
         <w:spacing w:after="0"/>
         <w:rPr>
-          <w:rFonts w:ascii="Calibri" w:hAnsi="Calibri" w:eastAsia="Calibri" w:cs="Calibri"/>
+          <w:rFonts w:ascii="Calibri" w:eastAsia="Calibri" w:hAnsi="Calibri" w:cs="Calibri"/>
           <w:sz w:val="32"/>
           <w:szCs w:val="32"/>
           <w:lang w:val="es-MX"/>
@@ -3644,15 +3425,15 @@
       <w:pPr>
         <w:spacing w:after="0"/>
         <w:rPr>
-          <w:rFonts w:ascii="Calibri" w:hAnsi="Calibri" w:eastAsia="Calibri" w:cs="Calibri"/>
-          <w:sz w:val="32"/>
-          <w:szCs w:val="32"/>
-          <w:lang w:val="es-MX"/>
-        </w:rPr>
-      </w:pPr>
-      <w:r>
-        <w:rPr>
-          <w:rFonts w:ascii="Calibri" w:hAnsi="Calibri" w:eastAsia="Calibri" w:cs="Calibri"/>
+          <w:rFonts w:ascii="Calibri" w:eastAsia="Calibri" w:hAnsi="Calibri" w:cs="Calibri"/>
+          <w:sz w:val="32"/>
+          <w:szCs w:val="32"/>
+          <w:lang w:val="es-MX"/>
+        </w:rPr>
+      </w:pPr>
+      <w:r>
+        <w:rPr>
+          <w:rFonts w:ascii="Calibri" w:eastAsia="Calibri" w:hAnsi="Calibri" w:cs="Calibri"/>
           <w:sz w:val="32"/>
           <w:szCs w:val="32"/>
           <w:lang w:val="es-MX"/>
@@ -3661,7 +3442,7 @@
       </w:r>
       <w:r>
         <w:rPr>
-          <w:rFonts w:ascii="Calibri" w:hAnsi="Calibri" w:eastAsia="Calibri" w:cs="Calibri"/>
+          <w:rFonts w:ascii="Calibri" w:eastAsia="Calibri" w:hAnsi="Calibri" w:cs="Calibri"/>
           <w:sz w:val="32"/>
           <w:szCs w:val="32"/>
           <w:lang w:val="es-MX"/>
@@ -3673,24 +3454,25 @@
       <w:pPr>
         <w:spacing w:after="0"/>
         <w:rPr>
-          <w:rFonts w:ascii="Calibri" w:hAnsi="Calibri" w:eastAsia="Calibri" w:cs="Calibri"/>
-          <w:sz w:val="32"/>
-          <w:szCs w:val="32"/>
-          <w:lang w:val="es-MX"/>
-        </w:rPr>
-      </w:pPr>
-      <w:r>
-        <w:rPr>
-          <w:rFonts w:ascii="Calibri" w:hAnsi="Calibri" w:eastAsia="Calibri" w:cs="Calibri"/>
-          <w:sz w:val="32"/>
-          <w:szCs w:val="32"/>
-          <w:lang w:val="es-MX"/>
-        </w:rPr>
+          <w:rFonts w:ascii="Calibri" w:eastAsia="Calibri" w:hAnsi="Calibri" w:cs="Calibri"/>
+          <w:sz w:val="32"/>
+          <w:szCs w:val="32"/>
+          <w:lang w:val="es-MX"/>
+        </w:rPr>
+      </w:pPr>
+      <w:r>
+        <w:rPr>
+          <w:rFonts w:ascii="Calibri" w:eastAsia="Calibri" w:hAnsi="Calibri" w:cs="Calibri"/>
+          <w:sz w:val="32"/>
+          <w:szCs w:val="32"/>
+          <w:lang w:val="es-MX"/>
+        </w:rPr>
+        <w:lastRenderedPageBreak/>
         <w:t xml:space="preserve">Este grafo </w:t>
       </w:r>
       <w:r>
         <w:rPr>
-          <w:rFonts w:ascii="Calibri" w:hAnsi="Calibri" w:eastAsia="Calibri" w:cs="Calibri"/>
+          <w:rFonts w:ascii="Calibri" w:eastAsia="Calibri" w:hAnsi="Calibri" w:cs="Calibri"/>
           <w:sz w:val="32"/>
           <w:szCs w:val="32"/>
           <w:lang w:val="es-MX"/>
@@ -3699,7 +3481,7 @@
       </w:r>
       <w:r>
         <w:rPr>
-          <w:rFonts w:ascii="Calibri" w:hAnsi="Calibri" w:eastAsia="Calibri" w:cs="Calibri"/>
+          <w:rFonts w:ascii="Calibri" w:eastAsia="Calibri" w:hAnsi="Calibri" w:cs="Calibri"/>
           <w:sz w:val="32"/>
           <w:szCs w:val="32"/>
           <w:lang w:val="es-MX"/>
@@ -3708,7 +3490,7 @@
       </w:r>
       <w:r>
         <w:rPr>
-          <w:rFonts w:ascii="Calibri" w:hAnsi="Calibri" w:eastAsia="Calibri" w:cs="Calibri"/>
+          <w:rFonts w:ascii="Calibri" w:eastAsia="Calibri" w:hAnsi="Calibri" w:cs="Calibri"/>
           <w:sz w:val="32"/>
           <w:szCs w:val="32"/>
           <w:lang w:val="es-MX"/>
@@ -3717,7 +3499,7 @@
       </w:r>
       <w:r>
         <w:rPr>
-          <w:rFonts w:ascii="Calibri" w:hAnsi="Calibri" w:eastAsia="Calibri" w:cs="Calibri"/>
+          <w:rFonts w:ascii="Calibri" w:eastAsia="Calibri" w:hAnsi="Calibri" w:cs="Calibri"/>
           <w:sz w:val="32"/>
           <w:szCs w:val="32"/>
           <w:lang w:val="es-MX"/>
@@ -3734,15 +3516,15 @@
         </w:numPr>
         <w:spacing w:after="0"/>
         <w:rPr>
-          <w:rFonts w:ascii="Calibri" w:hAnsi="Calibri" w:eastAsia="Calibri" w:cs="Calibri"/>
-          <w:sz w:val="32"/>
-          <w:szCs w:val="32"/>
-          <w:lang w:val="es-MX"/>
-        </w:rPr>
-      </w:pPr>
-      <w:r>
-        <w:rPr>
-          <w:rFonts w:ascii="Calibri" w:hAnsi="Calibri" w:eastAsia="Calibri" w:cs="Calibri"/>
+          <w:rFonts w:ascii="Calibri" w:eastAsia="Calibri" w:hAnsi="Calibri" w:cs="Calibri"/>
+          <w:sz w:val="32"/>
+          <w:szCs w:val="32"/>
+          <w:lang w:val="es-MX"/>
+        </w:rPr>
+      </w:pPr>
+      <w:r>
+        <w:rPr>
+          <w:rFonts w:ascii="Calibri" w:eastAsia="Calibri" w:hAnsi="Calibri" w:cs="Calibri"/>
           <w:sz w:val="32"/>
           <w:szCs w:val="32"/>
           <w:lang w:val="es-MX"/>
@@ -3751,7 +3533,7 @@
       </w:r>
       <w:r>
         <w:rPr>
-          <w:rFonts w:ascii="Calibri" w:hAnsi="Calibri" w:eastAsia="Calibri" w:cs="Calibri"/>
+          <w:rFonts w:ascii="Calibri" w:eastAsia="Calibri" w:hAnsi="Calibri" w:cs="Calibri"/>
           <w:sz w:val="32"/>
           <w:szCs w:val="32"/>
           <w:lang w:val="es-MX"/>
@@ -3768,15 +3550,15 @@
         </w:numPr>
         <w:spacing w:after="0"/>
         <w:rPr>
-          <w:rFonts w:ascii="Calibri" w:hAnsi="Calibri" w:eastAsia="Calibri" w:cs="Calibri"/>
-          <w:sz w:val="32"/>
-          <w:szCs w:val="32"/>
-          <w:lang w:val="es-MX"/>
-        </w:rPr>
-      </w:pPr>
-      <w:r>
-        <w:rPr>
-          <w:rFonts w:ascii="Calibri" w:hAnsi="Calibri" w:eastAsia="Calibri" w:cs="Calibri"/>
+          <w:rFonts w:ascii="Calibri" w:eastAsia="Calibri" w:hAnsi="Calibri" w:cs="Calibri"/>
+          <w:sz w:val="32"/>
+          <w:szCs w:val="32"/>
+          <w:lang w:val="es-MX"/>
+        </w:rPr>
+      </w:pPr>
+      <w:r>
+        <w:rPr>
+          <w:rFonts w:ascii="Calibri" w:eastAsia="Calibri" w:hAnsi="Calibri" w:cs="Calibri"/>
           <w:sz w:val="32"/>
           <w:szCs w:val="32"/>
           <w:lang w:val="es-MX"/>
@@ -3785,7 +3567,7 @@
       </w:r>
       <w:r>
         <w:rPr>
-          <w:rFonts w:ascii="Calibri" w:hAnsi="Calibri" w:eastAsia="Calibri" w:cs="Calibri"/>
+          <w:rFonts w:ascii="Calibri" w:eastAsia="Calibri" w:hAnsi="Calibri" w:cs="Calibri"/>
           <w:sz w:val="32"/>
           <w:szCs w:val="32"/>
           <w:lang w:val="es-MX"/>
@@ -3794,7 +3576,7 @@
       </w:r>
       <w:r>
         <w:rPr>
-          <w:rFonts w:ascii="Calibri" w:hAnsi="Calibri" w:eastAsia="Calibri" w:cs="Calibri"/>
+          <w:rFonts w:ascii="Calibri" w:eastAsia="Calibri" w:hAnsi="Calibri" w:cs="Calibri"/>
           <w:sz w:val="32"/>
           <w:szCs w:val="32"/>
           <w:lang w:val="es-MX"/>
@@ -3803,7 +3585,7 @@
       </w:r>
       <w:r>
         <w:rPr>
-          <w:rFonts w:ascii="Calibri" w:hAnsi="Calibri" w:eastAsia="Calibri" w:cs="Calibri"/>
+          <w:rFonts w:ascii="Calibri" w:eastAsia="Calibri" w:hAnsi="Calibri" w:cs="Calibri"/>
           <w:sz w:val="32"/>
           <w:szCs w:val="32"/>
           <w:lang w:val="es-MX"/>
@@ -3812,7 +3594,7 @@
       </w:r>
       <w:r>
         <w:rPr>
-          <w:rFonts w:ascii="Calibri" w:hAnsi="Calibri" w:eastAsia="Calibri" w:cs="Calibri"/>
+          <w:rFonts w:ascii="Calibri" w:eastAsia="Calibri" w:hAnsi="Calibri" w:cs="Calibri"/>
           <w:sz w:val="32"/>
           <w:szCs w:val="32"/>
           <w:lang w:val="es-MX"/>
@@ -3824,7 +3606,7 @@
       <w:pPr>
         <w:spacing w:after="0"/>
         <w:rPr>
-          <w:rFonts w:ascii="Calibri" w:hAnsi="Calibri" w:eastAsia="Calibri" w:cs="Calibri"/>
+          <w:rFonts w:ascii="Calibri" w:eastAsia="Calibri" w:hAnsi="Calibri" w:cs="Calibri"/>
           <w:sz w:val="32"/>
           <w:szCs w:val="32"/>
           <w:lang w:val="es-MX"/>
@@ -3835,15 +3617,15 @@
       <w:pPr>
         <w:spacing w:after="0"/>
         <w:rPr>
-          <w:rFonts w:ascii="Calibri" w:hAnsi="Calibri" w:eastAsia="Calibri" w:cs="Calibri"/>
-          <w:sz w:val="32"/>
-          <w:szCs w:val="32"/>
-          <w:lang w:val="es-MX"/>
-        </w:rPr>
-      </w:pPr>
-      <w:r>
-        <w:rPr>
-          <w:rFonts w:ascii="Calibri" w:hAnsi="Calibri" w:eastAsia="Calibri" w:cs="Calibri"/>
+          <w:rFonts w:ascii="Calibri" w:eastAsia="Calibri" w:hAnsi="Calibri" w:cs="Calibri"/>
+          <w:sz w:val="32"/>
+          <w:szCs w:val="32"/>
+          <w:lang w:val="es-MX"/>
+        </w:rPr>
+      </w:pPr>
+      <w:r>
+        <w:rPr>
+          <w:rFonts w:ascii="Calibri" w:eastAsia="Calibri" w:hAnsi="Calibri" w:cs="Calibri"/>
           <w:sz w:val="32"/>
           <w:szCs w:val="32"/>
           <w:lang w:val="es-MX"/>
@@ -3855,7 +3637,7 @@
       <w:pPr>
         <w:spacing w:after="0"/>
         <w:rPr>
-          <w:rFonts w:ascii="Calibri" w:hAnsi="Calibri" w:eastAsia="Calibri" w:cs="Calibri"/>
+          <w:rFonts w:ascii="Calibri" w:eastAsia="Calibri" w:hAnsi="Calibri" w:cs="Calibri"/>
           <w:sz w:val="32"/>
           <w:szCs w:val="32"/>
           <w:lang w:val="es-MX"/>
@@ -3867,15 +3649,15 @@
         <w:spacing w:after="0"/>
         <w:jc w:val="center"/>
         <w:rPr>
-          <w:rFonts w:ascii="Calibri" w:hAnsi="Calibri" w:eastAsia="Calibri" w:cs="Calibri"/>
-          <w:sz w:val="32"/>
-          <w:szCs w:val="32"/>
-          <w:lang w:val="es-MX"/>
-        </w:rPr>
-      </w:pPr>
-      <w:r>
-        <w:rPr>
-          <w:rFonts w:ascii="Calibri" w:hAnsi="Calibri" w:eastAsia="Calibri" w:cs="Calibri"/>
+          <w:rFonts w:ascii="Calibri" w:eastAsia="Calibri" w:hAnsi="Calibri" w:cs="Calibri"/>
+          <w:sz w:val="32"/>
+          <w:szCs w:val="32"/>
+          <w:lang w:val="es-MX"/>
+        </w:rPr>
+      </w:pPr>
+      <w:r>
+        <w:rPr>
+          <w:rFonts w:ascii="Calibri" w:eastAsia="Calibri" w:hAnsi="Calibri" w:cs="Calibri"/>
           <w:sz w:val="32"/>
           <w:szCs w:val="32"/>
           <w:lang w:val="es-MX"/>
@@ -3888,40 +3670,20 @@
         <w:spacing w:after="0"/>
         <w:jc w:val="center"/>
         <w:rPr>
-          <w:rFonts w:ascii="Calibri" w:hAnsi="Calibri" w:eastAsia="Calibri" w:cs="Calibri"/>
-          <w:sz w:val="32"/>
-          <w:szCs w:val="32"/>
-          <w:lang w:val="es-MX"/>
-        </w:rPr>
-      </w:pPr>
-      <w:r>
-        <w:rPr>
-          <w:rFonts w:ascii="Calibri" w:hAnsi="Calibri" w:eastAsia="Calibri" w:cs="Calibri"/>
-          <w:sz w:val="32"/>
-          <w:szCs w:val="32"/>
-          <w:lang w:val="es-MX"/>
-        </w:rPr>
-        <w:t xml:space="preserve">{1.4 </w:t>
-      </w:r>
-      <w:proofErr w:type="spellStart"/>
-      <w:r>
-        <w:rPr>
-          <w:rFonts w:ascii="Calibri" w:hAnsi="Calibri" w:eastAsia="Calibri" w:cs="Calibri"/>
-          <w:sz w:val="32"/>
-          <w:szCs w:val="32"/>
-          <w:lang w:val="es-MX"/>
-        </w:rPr>
-        <w:t>hrs</w:t>
-      </w:r>
-      <w:proofErr w:type="spellEnd"/>
-      <w:r>
-        <w:rPr>
-          <w:rFonts w:ascii="Calibri" w:hAnsi="Calibri" w:eastAsia="Calibri" w:cs="Calibri"/>
-          <w:sz w:val="32"/>
-          <w:szCs w:val="32"/>
-          <w:lang w:val="es-MX"/>
-        </w:rPr>
-        <w:t>, $60}</w:t>
+          <w:rFonts w:ascii="Calibri" w:eastAsia="Calibri" w:hAnsi="Calibri" w:cs="Calibri"/>
+          <w:sz w:val="32"/>
+          <w:szCs w:val="32"/>
+          <w:lang w:val="es-MX"/>
+        </w:rPr>
+      </w:pPr>
+      <w:r>
+        <w:rPr>
+          <w:rFonts w:ascii="Calibri" w:eastAsia="Calibri" w:hAnsi="Calibri" w:cs="Calibri"/>
+          <w:sz w:val="32"/>
+          <w:szCs w:val="32"/>
+          <w:lang w:val="es-MX"/>
+        </w:rPr>
+        <w:t>{1.4 hrs, $60}</w:t>
       </w:r>
     </w:p>
     <w:p>
@@ -3929,7 +3691,7 @@
         <w:spacing w:after="0"/>
         <w:jc w:val="center"/>
         <w:rPr>
-          <w:rFonts w:ascii="Calibri" w:hAnsi="Calibri" w:eastAsia="Calibri" w:cs="Calibri"/>
+          <w:rFonts w:ascii="Calibri" w:eastAsia="Calibri" w:hAnsi="Calibri" w:cs="Calibri"/>
           <w:sz w:val="32"/>
           <w:szCs w:val="32"/>
           <w:lang w:val="es-MX"/>
@@ -3940,15 +3702,15 @@
       <w:pPr>
         <w:spacing w:after="0"/>
         <w:rPr>
-          <w:rFonts w:ascii="Calibri" w:hAnsi="Calibri" w:eastAsia="Calibri" w:cs="Calibri"/>
-          <w:sz w:val="32"/>
-          <w:szCs w:val="32"/>
-          <w:lang w:val="es-MX"/>
-        </w:rPr>
-      </w:pPr>
-      <w:r>
-        <w:rPr>
-          <w:rFonts w:ascii="Calibri" w:hAnsi="Calibri" w:eastAsia="Calibri" w:cs="Calibri"/>
+          <w:rFonts w:ascii="Calibri" w:eastAsia="Calibri" w:hAnsi="Calibri" w:cs="Calibri"/>
+          <w:sz w:val="32"/>
+          <w:szCs w:val="32"/>
+          <w:lang w:val="es-MX"/>
+        </w:rPr>
+      </w:pPr>
+      <w:r>
+        <w:rPr>
+          <w:rFonts w:ascii="Calibri" w:eastAsia="Calibri" w:hAnsi="Calibri" w:cs="Calibri"/>
           <w:sz w:val="32"/>
           <w:szCs w:val="32"/>
           <w:lang w:val="es-MX"/>
@@ -3957,7 +3719,7 @@
       </w:r>
       <w:r>
         <w:rPr>
-          <w:rFonts w:ascii="Calibri" w:hAnsi="Calibri" w:eastAsia="Calibri" w:cs="Calibri"/>
+          <w:rFonts w:ascii="Calibri" w:eastAsia="Calibri" w:hAnsi="Calibri" w:cs="Calibri"/>
           <w:sz w:val="32"/>
           <w:szCs w:val="32"/>
           <w:lang w:val="es-MX"/>
@@ -3969,7 +3731,7 @@
       <w:pPr>
         <w:spacing w:after="0"/>
         <w:rPr>
-          <w:rFonts w:ascii="Calibri" w:hAnsi="Calibri" w:eastAsia="Calibri" w:cs="Calibri"/>
+          <w:rFonts w:ascii="Calibri" w:eastAsia="Calibri" w:hAnsi="Calibri" w:cs="Calibri"/>
           <w:sz w:val="32"/>
           <w:szCs w:val="32"/>
           <w:lang w:val="es-MX"/>
@@ -3980,15 +3742,15 @@
       <w:pPr>
         <w:spacing w:after="0"/>
         <w:rPr>
-          <w:rFonts w:ascii="Calibri" w:hAnsi="Calibri" w:eastAsia="Calibri" w:cs="Calibri"/>
-          <w:sz w:val="32"/>
-          <w:szCs w:val="32"/>
-          <w:lang w:val="es-MX"/>
-        </w:rPr>
-      </w:pPr>
-      <w:r>
-        <w:rPr>
-          <w:rFonts w:ascii="Calibri" w:hAnsi="Calibri" w:eastAsia="Calibri" w:cs="Calibri"/>
+          <w:rFonts w:ascii="Calibri" w:eastAsia="Calibri" w:hAnsi="Calibri" w:cs="Calibri"/>
+          <w:sz w:val="32"/>
+          <w:szCs w:val="32"/>
+          <w:lang w:val="es-MX"/>
+        </w:rPr>
+      </w:pPr>
+      <w:r>
+        <w:rPr>
+          <w:rFonts w:ascii="Calibri" w:eastAsia="Calibri" w:hAnsi="Calibri" w:cs="Calibri"/>
           <w:sz w:val="32"/>
           <w:szCs w:val="32"/>
           <w:lang w:val="es-MX"/>
@@ -3997,7 +3759,7 @@
       </w:r>
       <w:r>
         <w:rPr>
-          <w:rFonts w:ascii="Calibri" w:hAnsi="Calibri" w:eastAsia="Calibri" w:cs="Calibri"/>
+          <w:rFonts w:ascii="Calibri" w:eastAsia="Calibri" w:hAnsi="Calibri" w:cs="Calibri"/>
           <w:sz w:val="32"/>
           <w:szCs w:val="32"/>
           <w:lang w:val="es-MX"/>
@@ -4009,15 +3771,15 @@
       <w:pPr>
         <w:spacing w:after="0"/>
         <w:rPr>
-          <w:rFonts w:ascii="Calibri" w:hAnsi="Calibri" w:eastAsia="Calibri" w:cs="Calibri"/>
-          <w:sz w:val="32"/>
-          <w:szCs w:val="32"/>
-          <w:lang w:val="es-MX"/>
-        </w:rPr>
-      </w:pPr>
-      <w:r>
-        <w:rPr>
-          <w:rFonts w:ascii="Calibri" w:hAnsi="Calibri" w:eastAsia="Calibri" w:cs="Calibri"/>
+          <w:rFonts w:ascii="Calibri" w:eastAsia="Calibri" w:hAnsi="Calibri" w:cs="Calibri"/>
+          <w:sz w:val="32"/>
+          <w:szCs w:val="32"/>
+          <w:lang w:val="es-MX"/>
+        </w:rPr>
+      </w:pPr>
+      <w:r>
+        <w:rPr>
+          <w:rFonts w:ascii="Calibri" w:eastAsia="Calibri" w:hAnsi="Calibri" w:cs="Calibri"/>
           <w:sz w:val="32"/>
           <w:szCs w:val="32"/>
           <w:lang w:val="es-MX"/>
@@ -4026,7 +3788,7 @@
       </w:r>
       <w:r>
         <w:rPr>
-          <w:rFonts w:ascii="Calibri" w:hAnsi="Calibri" w:eastAsia="Calibri" w:cs="Calibri"/>
+          <w:rFonts w:ascii="Calibri" w:eastAsia="Calibri" w:hAnsi="Calibri" w:cs="Calibri"/>
           <w:sz w:val="32"/>
           <w:szCs w:val="32"/>
           <w:lang w:val="es-MX"/>
@@ -4035,7 +3797,7 @@
       </w:r>
       <w:r>
         <w:rPr>
-          <w:rFonts w:ascii="Calibri" w:hAnsi="Calibri" w:eastAsia="Calibri" w:cs="Calibri"/>
+          <w:rFonts w:ascii="Calibri" w:eastAsia="Calibri" w:hAnsi="Calibri" w:cs="Calibri"/>
           <w:sz w:val="32"/>
           <w:szCs w:val="32"/>
           <w:lang w:val="es-MX"/>
@@ -4047,7 +3809,7 @@
       <w:pPr>
         <w:spacing w:after="0"/>
         <w:rPr>
-          <w:rFonts w:ascii="Calibri" w:hAnsi="Calibri" w:eastAsia="Calibri" w:cs="Calibri"/>
+          <w:rFonts w:ascii="Calibri" w:eastAsia="Calibri" w:hAnsi="Calibri" w:cs="Calibri"/>
           <w:sz w:val="32"/>
           <w:szCs w:val="32"/>
           <w:lang w:val="es-MX"/>
@@ -4059,15 +3821,15 @@
         <w:spacing w:after="0"/>
         <w:jc w:val="center"/>
         <w:rPr>
-          <w:rFonts w:ascii="Calibri" w:hAnsi="Calibri" w:eastAsia="Calibri" w:cs="Calibri"/>
-          <w:sz w:val="32"/>
-          <w:szCs w:val="32"/>
-          <w:lang w:val="es-MX"/>
-        </w:rPr>
-      </w:pPr>
-      <w:r>
-        <w:rPr>
-          <w:rFonts w:ascii="Calibri" w:hAnsi="Calibri" w:eastAsia="Calibri" w:cs="Calibri"/>
+          <w:rFonts w:ascii="Calibri" w:eastAsia="Calibri" w:hAnsi="Calibri" w:cs="Calibri"/>
+          <w:sz w:val="32"/>
+          <w:szCs w:val="32"/>
+          <w:lang w:val="es-MX"/>
+        </w:rPr>
+      </w:pPr>
+      <w:r>
+        <w:rPr>
+          <w:rFonts w:ascii="Calibri" w:eastAsia="Calibri" w:hAnsi="Calibri" w:cs="Calibri"/>
           <w:sz w:val="32"/>
           <w:szCs w:val="32"/>
           <w:lang w:val="es-MX"/>
@@ -4080,15 +3842,15 @@
         <w:spacing w:after="0"/>
         <w:jc w:val="center"/>
         <w:rPr>
-          <w:rFonts w:ascii="Calibri" w:hAnsi="Calibri" w:eastAsia="Calibri" w:cs="Calibri"/>
-          <w:sz w:val="32"/>
-          <w:szCs w:val="32"/>
-          <w:lang w:val="es-MX"/>
-        </w:rPr>
-      </w:pPr>
-      <w:r>
-        <w:rPr>
-          <w:rFonts w:ascii="Calibri" w:hAnsi="Calibri" w:eastAsia="Calibri" w:cs="Calibri"/>
+          <w:rFonts w:ascii="Calibri" w:eastAsia="Calibri" w:hAnsi="Calibri" w:cs="Calibri"/>
+          <w:sz w:val="32"/>
+          <w:szCs w:val="32"/>
+          <w:lang w:val="es-MX"/>
+        </w:rPr>
+      </w:pPr>
+      <w:r>
+        <w:rPr>
+          <w:rFonts w:ascii="Calibri" w:eastAsia="Calibri" w:hAnsi="Calibri" w:cs="Calibri"/>
           <w:sz w:val="32"/>
           <w:szCs w:val="32"/>
           <w:lang w:val="es-MX"/>
@@ -4101,7 +3863,7 @@
         <w:spacing w:after="0"/>
         <w:jc w:val="center"/>
         <w:rPr>
-          <w:rFonts w:ascii="Calibri" w:hAnsi="Calibri" w:eastAsia="Calibri" w:cs="Calibri"/>
+          <w:rFonts w:ascii="Calibri" w:eastAsia="Calibri" w:hAnsi="Calibri" w:cs="Calibri"/>
           <w:sz w:val="32"/>
           <w:szCs w:val="32"/>
           <w:lang w:val="es-MX"/>
@@ -4112,15 +3874,15 @@
       <w:pPr>
         <w:spacing w:after="0"/>
         <w:rPr>
-          <w:rFonts w:ascii="Calibri" w:hAnsi="Calibri" w:eastAsia="Calibri" w:cs="Calibri"/>
-          <w:sz w:val="32"/>
-          <w:szCs w:val="32"/>
-          <w:lang w:val="es-MX"/>
-        </w:rPr>
-      </w:pPr>
-      <w:r>
-        <w:rPr>
-          <w:rFonts w:ascii="Calibri" w:hAnsi="Calibri" w:eastAsia="Calibri" w:cs="Calibri"/>
+          <w:rFonts w:ascii="Calibri" w:eastAsia="Calibri" w:hAnsi="Calibri" w:cs="Calibri"/>
+          <w:sz w:val="32"/>
+          <w:szCs w:val="32"/>
+          <w:lang w:val="es-MX"/>
+        </w:rPr>
+      </w:pPr>
+      <w:r>
+        <w:rPr>
+          <w:rFonts w:ascii="Calibri" w:eastAsia="Calibri" w:hAnsi="Calibri" w:cs="Calibri"/>
           <w:sz w:val="32"/>
           <w:szCs w:val="32"/>
           <w:lang w:val="es-MX"/>
@@ -4129,7 +3891,7 @@
       </w:r>
       <w:r>
         <w:rPr>
-          <w:rFonts w:ascii="Calibri" w:hAnsi="Calibri" w:eastAsia="Calibri" w:cs="Calibri"/>
+          <w:rFonts w:ascii="Calibri" w:eastAsia="Calibri" w:hAnsi="Calibri" w:cs="Calibri"/>
           <w:sz w:val="32"/>
           <w:szCs w:val="32"/>
           <w:lang w:val="es-MX"/>
@@ -4141,15 +3903,15 @@
       <w:pPr>
         <w:spacing w:after="0"/>
         <w:rPr>
-          <w:rFonts w:ascii="Calibri" w:hAnsi="Calibri" w:eastAsia="Calibri" w:cs="Calibri"/>
-          <w:sz w:val="32"/>
-          <w:szCs w:val="32"/>
-          <w:lang w:val="es-MX"/>
-        </w:rPr>
-      </w:pPr>
-      <w:r>
-        <w:rPr>
-          <w:rFonts w:ascii="Calibri" w:hAnsi="Calibri" w:eastAsia="Calibri" w:cs="Calibri"/>
+          <w:rFonts w:ascii="Calibri" w:eastAsia="Calibri" w:hAnsi="Calibri" w:cs="Calibri"/>
+          <w:sz w:val="32"/>
+          <w:szCs w:val="32"/>
+          <w:lang w:val="es-MX"/>
+        </w:rPr>
+      </w:pPr>
+      <w:r>
+        <w:rPr>
+          <w:rFonts w:ascii="Calibri" w:eastAsia="Calibri" w:hAnsi="Calibri" w:cs="Calibri"/>
           <w:sz w:val="32"/>
           <w:szCs w:val="32"/>
           <w:lang w:val="es-MX"/>
@@ -4158,7 +3920,7 @@
       </w:r>
       <w:r>
         <w:rPr>
-          <w:rFonts w:ascii="Calibri" w:hAnsi="Calibri" w:eastAsia="Calibri" w:cs="Calibri"/>
+          <w:rFonts w:ascii="Calibri" w:eastAsia="Calibri" w:hAnsi="Calibri" w:cs="Calibri"/>
           <w:sz w:val="32"/>
           <w:szCs w:val="32"/>
           <w:lang w:val="es-MX"/>
@@ -4167,7 +3929,7 @@
       </w:r>
       <w:r>
         <w:rPr>
-          <w:rFonts w:ascii="Calibri" w:hAnsi="Calibri" w:eastAsia="Calibri" w:cs="Calibri"/>
+          <w:rFonts w:ascii="Calibri" w:eastAsia="Calibri" w:hAnsi="Calibri" w:cs="Calibri"/>
           <w:sz w:val="32"/>
           <w:szCs w:val="32"/>
           <w:lang w:val="es-MX"/>
@@ -4179,15 +3941,15 @@
       <w:pPr>
         <w:spacing w:after="0"/>
         <w:rPr>
-          <w:rFonts w:ascii="Calibri" w:hAnsi="Calibri" w:eastAsia="Calibri" w:cs="Calibri"/>
-          <w:sz w:val="32"/>
-          <w:szCs w:val="32"/>
-          <w:lang w:val="es-MX"/>
-        </w:rPr>
-      </w:pPr>
-      <w:r>
-        <w:rPr>
-          <w:rFonts w:ascii="Calibri" w:hAnsi="Calibri" w:eastAsia="Calibri" w:cs="Calibri"/>
+          <w:rFonts w:ascii="Calibri" w:eastAsia="Calibri" w:hAnsi="Calibri" w:cs="Calibri"/>
+          <w:sz w:val="32"/>
+          <w:szCs w:val="32"/>
+          <w:lang w:val="es-MX"/>
+        </w:rPr>
+      </w:pPr>
+      <w:r>
+        <w:rPr>
+          <w:rFonts w:ascii="Calibri" w:eastAsia="Calibri" w:hAnsi="Calibri" w:cs="Calibri"/>
           <w:sz w:val="32"/>
           <w:szCs w:val="32"/>
           <w:lang w:val="es-MX"/>
@@ -4200,24 +3962,25 @@
         <w:spacing w:after="0"/>
         <w:jc w:val="center"/>
         <w:rPr>
-          <w:rFonts w:ascii="Calibri" w:hAnsi="Calibri" w:eastAsia="Calibri" w:cs="Calibri"/>
-          <w:sz w:val="32"/>
-          <w:szCs w:val="32"/>
-          <w:lang w:val="es-MX"/>
-        </w:rPr>
-      </w:pPr>
-      <w:r>
-        <w:rPr>
-          <w:rFonts w:ascii="Calibri" w:hAnsi="Calibri" w:eastAsia="Calibri" w:cs="Calibri"/>
-          <w:sz w:val="32"/>
-          <w:szCs w:val="32"/>
-          <w:lang w:val="es-MX"/>
-        </w:rPr>
+          <w:rFonts w:ascii="Calibri" w:eastAsia="Calibri" w:hAnsi="Calibri" w:cs="Calibri"/>
+          <w:sz w:val="32"/>
+          <w:szCs w:val="32"/>
+          <w:lang w:val="es-MX"/>
+        </w:rPr>
+      </w:pPr>
+      <w:r>
+        <w:rPr>
+          <w:rFonts w:ascii="Calibri" w:eastAsia="Calibri" w:hAnsi="Calibri" w:cs="Calibri"/>
+          <w:sz w:val="32"/>
+          <w:szCs w:val="32"/>
+          <w:lang w:val="es-MX"/>
+        </w:rPr>
+        <w:lastRenderedPageBreak/>
         <w:t xml:space="preserve">Nueva York -&gt; Tokio = </w:t>
       </w:r>
       <w:r>
         <w:rPr>
-          <w:rFonts w:ascii="Calibri" w:hAnsi="Calibri" w:eastAsia="Calibri" w:cs="Calibri"/>
+          <w:rFonts w:ascii="Calibri" w:eastAsia="Calibri" w:hAnsi="Calibri" w:cs="Calibri"/>
           <w:sz w:val="32"/>
           <w:szCs w:val="32"/>
           <w:lang w:val="es-MX"/>
@@ -4230,15 +3993,15 @@
         <w:spacing w:after="0"/>
         <w:jc w:val="center"/>
         <w:rPr>
-          <w:rFonts w:ascii="Calibri" w:hAnsi="Calibri" w:eastAsia="Calibri" w:cs="Calibri"/>
-          <w:sz w:val="32"/>
-          <w:szCs w:val="32"/>
-          <w:lang w:val="es-MX"/>
-        </w:rPr>
-      </w:pPr>
-      <w:r>
-        <w:rPr>
-          <w:rFonts w:ascii="Calibri" w:hAnsi="Calibri" w:eastAsia="Calibri" w:cs="Calibri"/>
+          <w:rFonts w:ascii="Calibri" w:eastAsia="Calibri" w:hAnsi="Calibri" w:cs="Calibri"/>
+          <w:sz w:val="32"/>
+          <w:szCs w:val="32"/>
+          <w:lang w:val="es-MX"/>
+        </w:rPr>
+      </w:pPr>
+      <w:r>
+        <w:rPr>
+          <w:rFonts w:ascii="Calibri" w:eastAsia="Calibri" w:hAnsi="Calibri" w:cs="Calibri"/>
           <w:sz w:val="32"/>
           <w:szCs w:val="32"/>
           <w:lang w:val="es-MX"/>
@@ -4247,7 +4010,7 @@
       </w:r>
       <w:r>
         <w:rPr>
-          <w:rFonts w:ascii="Calibri" w:hAnsi="Calibri" w:eastAsia="Calibri" w:cs="Calibri"/>
+          <w:rFonts w:ascii="Calibri" w:eastAsia="Calibri" w:hAnsi="Calibri" w:cs="Calibri"/>
           <w:sz w:val="32"/>
           <w:szCs w:val="32"/>
           <w:lang w:val="es-MX"/>
@@ -4256,7 +4019,7 @@
       </w:r>
       <w:r>
         <w:rPr>
-          <w:rFonts w:ascii="Calibri" w:hAnsi="Calibri" w:eastAsia="Calibri" w:cs="Calibri"/>
+          <w:rFonts w:ascii="Calibri" w:eastAsia="Calibri" w:hAnsi="Calibri" w:cs="Calibri"/>
           <w:sz w:val="32"/>
           <w:szCs w:val="32"/>
           <w:lang w:val="es-MX"/>
@@ -4269,7 +4032,7 @@
         <w:spacing w:after="0"/>
         <w:jc w:val="center"/>
         <w:rPr>
-          <w:rFonts w:ascii="Calibri" w:hAnsi="Calibri" w:eastAsia="Calibri" w:cs="Calibri"/>
+          <w:rFonts w:ascii="Calibri" w:eastAsia="Calibri" w:hAnsi="Calibri" w:cs="Calibri"/>
           <w:sz w:val="32"/>
           <w:szCs w:val="32"/>
           <w:lang w:val="es-MX"/>
@@ -4280,15 +4043,15 @@
       <w:pPr>
         <w:spacing w:after="0"/>
         <w:rPr>
-          <w:rFonts w:ascii="Calibri" w:hAnsi="Calibri" w:eastAsia="Calibri" w:cs="Calibri"/>
-          <w:sz w:val="32"/>
-          <w:szCs w:val="32"/>
-          <w:lang w:val="es-MX"/>
-        </w:rPr>
-      </w:pPr>
-      <w:r>
-        <w:rPr>
-          <w:rFonts w:ascii="Calibri" w:hAnsi="Calibri" w:eastAsia="Calibri" w:cs="Calibri"/>
+          <w:rFonts w:ascii="Calibri" w:eastAsia="Calibri" w:hAnsi="Calibri" w:cs="Calibri"/>
+          <w:sz w:val="32"/>
+          <w:szCs w:val="32"/>
+          <w:lang w:val="es-MX"/>
+        </w:rPr>
+      </w:pPr>
+      <w:r>
+        <w:rPr>
+          <w:rFonts w:ascii="Calibri" w:eastAsia="Calibri" w:hAnsi="Calibri" w:cs="Calibri"/>
           <w:sz w:val="32"/>
           <w:szCs w:val="32"/>
           <w:lang w:val="es-MX"/>
@@ -4297,7 +4060,7 @@
       </w:r>
       <w:r>
         <w:rPr>
-          <w:rFonts w:ascii="Calibri" w:hAnsi="Calibri" w:eastAsia="Calibri" w:cs="Calibri"/>
+          <w:rFonts w:ascii="Calibri" w:eastAsia="Calibri" w:hAnsi="Calibri" w:cs="Calibri"/>
           <w:sz w:val="32"/>
           <w:szCs w:val="32"/>
           <w:lang w:val="es-MX"/>
@@ -4306,7 +4069,7 @@
       </w:r>
       <w:r>
         <w:rPr>
-          <w:rFonts w:ascii="Calibri" w:hAnsi="Calibri" w:eastAsia="Calibri" w:cs="Calibri"/>
+          <w:rFonts w:ascii="Calibri" w:eastAsia="Calibri" w:hAnsi="Calibri" w:cs="Calibri"/>
           <w:sz w:val="32"/>
           <w:szCs w:val="32"/>
           <w:lang w:val="es-MX"/>
@@ -4318,41 +4081,372 @@
       <w:pPr>
         <w:spacing w:after="0"/>
         <w:rPr>
-          <w:rFonts w:ascii="Calibri" w:hAnsi="Calibri" w:eastAsia="Calibri" w:cs="Calibri"/>
-          <w:sz w:val="32"/>
-          <w:szCs w:val="32"/>
-          <w:lang w:val="es-MX"/>
-        </w:rPr>
-      </w:pPr>
-    </w:p>
-    <w:p>
-      <w:pPr>
-        <w:rPr>
-          <w:sz w:val="32"/>
-          <w:szCs w:val="32"/>
-          <w:lang w:val="es-MX"/>
-        </w:rPr>
-      </w:pPr>
-    </w:p>
-    <w:p>
-      <w:pPr>
-        <w:rPr>
+          <w:rFonts w:ascii="Calibri" w:eastAsia="Calibri" w:hAnsi="Calibri" w:cs="Calibri"/>
+          <w:sz w:val="32"/>
+          <w:szCs w:val="32"/>
+          <w:lang w:val="es-MX"/>
+        </w:rPr>
+      </w:pPr>
+    </w:p>
+    <w:p>
+      <w:pPr>
+        <w:rPr>
+          <w:rFonts w:ascii="Calibri" w:hAnsi="Calibri" w:cs="Calibri"/>
+          <w:sz w:val="32"/>
+          <w:szCs w:val="32"/>
+          <w:lang w:val="es-MX"/>
+        </w:rPr>
+      </w:pPr>
+    </w:p>
+    <w:p>
+      <w:pPr>
+        <w:rPr>
+          <w:rFonts w:ascii="Calibri" w:hAnsi="Calibri" w:cs="Calibri"/>
+          <w:sz w:val="32"/>
+          <w:szCs w:val="32"/>
+          <w:lang w:val="es-MX"/>
+        </w:rPr>
+      </w:pPr>
+      <w:r>
+        <w:rPr>
+          <w:rFonts w:ascii="Calibri" w:hAnsi="Calibri" w:cs="Calibri"/>
+          <w:sz w:val="32"/>
+          <w:szCs w:val="32"/>
+          <w:lang w:val="es-MX"/>
+        </w:rPr>
+        <w:t xml:space="preserve">3x </w:t>
+      </w:r>
+      <w:r>
+        <w:rPr>
+          <w:rFonts w:ascii="Calibri" w:hAnsi="Calibri" w:cs="Calibri"/>
+          <w:sz w:val="32"/>
+          <w:szCs w:val="32"/>
+          <w:lang w:val="es-MX"/>
+        </w:rPr>
+        <w:t>Programador</w:t>
+      </w:r>
+      <w:r>
+        <w:rPr>
+          <w:rFonts w:ascii="Calibri" w:hAnsi="Calibri" w:cs="Calibri"/>
+          <w:sz w:val="32"/>
+          <w:szCs w:val="32"/>
+          <w:lang w:val="es-MX"/>
+        </w:rPr>
+        <w:t>es</w:t>
+      </w:r>
+      <w:r>
+        <w:rPr>
+          <w:rFonts w:ascii="Calibri" w:hAnsi="Calibri" w:cs="Calibri"/>
+          <w:sz w:val="32"/>
+          <w:szCs w:val="32"/>
+          <w:lang w:val="es-MX"/>
+        </w:rPr>
+        <w:t xml:space="preserve"> principal C avanzado</w:t>
+      </w:r>
+      <w:r>
+        <w:rPr>
+          <w:rFonts w:ascii="Calibri" w:hAnsi="Calibri" w:cs="Calibri"/>
+          <w:sz w:val="32"/>
+          <w:szCs w:val="32"/>
+          <w:lang w:val="es-MX"/>
+        </w:rPr>
+        <w:t xml:space="preserve"> </w:t>
+      </w:r>
+      <w:r>
+        <w:rPr>
+          <w:rFonts w:ascii="Calibri" w:hAnsi="Calibri" w:cs="Calibri"/>
+          <w:sz w:val="32"/>
+          <w:szCs w:val="32"/>
+          <w:lang w:val="es-MX"/>
+        </w:rPr>
+        <w:t>$</w:t>
+      </w:r>
+      <w:r>
+        <w:rPr>
+          <w:rFonts w:ascii="Calibri" w:hAnsi="Calibri" w:cs="Calibri"/>
+          <w:sz w:val="32"/>
+          <w:szCs w:val="32"/>
+          <w:lang w:val="es-MX"/>
+        </w:rPr>
+        <w:t>15</w:t>
+      </w:r>
+      <w:r>
+        <w:rPr>
+          <w:rFonts w:ascii="Calibri" w:hAnsi="Calibri" w:cs="Calibri"/>
+          <w:sz w:val="32"/>
+          <w:szCs w:val="32"/>
+          <w:lang w:val="es-MX"/>
+        </w:rPr>
+        <w:t xml:space="preserve">,000 </w:t>
+      </w:r>
+      <w:r>
+        <w:rPr>
+          <w:rFonts w:ascii="Calibri" w:hAnsi="Calibri" w:cs="Calibri"/>
+          <w:sz w:val="32"/>
+          <w:szCs w:val="32"/>
+          <w:lang w:val="es-MX"/>
+        </w:rPr>
+        <w:t>c/u</w:t>
+      </w:r>
+    </w:p>
+    <w:p>
+      <w:pPr>
+        <w:rPr>
+          <w:rFonts w:ascii="Calibri" w:hAnsi="Calibri" w:cs="Calibri"/>
+          <w:sz w:val="32"/>
+          <w:szCs w:val="32"/>
+          <w:lang w:val="es-MX"/>
+        </w:rPr>
+      </w:pPr>
+      <w:r>
+        <w:rPr>
+          <w:rFonts w:ascii="Calibri" w:hAnsi="Calibri" w:cs="Calibri"/>
+          <w:sz w:val="32"/>
+          <w:szCs w:val="32"/>
+          <w:lang w:val="es-MX"/>
+        </w:rPr>
+        <w:t>Diseño de arquitectura/modularización</w:t>
+      </w:r>
+      <w:r>
+        <w:rPr>
+          <w:rFonts w:ascii="Calibri" w:hAnsi="Calibri" w:cs="Calibri"/>
+          <w:sz w:val="32"/>
+          <w:szCs w:val="32"/>
+          <w:lang w:val="es-MX"/>
+        </w:rPr>
+        <w:t xml:space="preserve"> </w:t>
+      </w:r>
+      <w:r>
+        <w:rPr>
+          <w:rFonts w:ascii="Calibri" w:hAnsi="Calibri" w:cs="Calibri"/>
+          <w:sz w:val="32"/>
+          <w:szCs w:val="32"/>
+          <w:lang w:val="es-MX"/>
+        </w:rPr>
+        <w:t>$</w:t>
+      </w:r>
+      <w:r>
+        <w:rPr>
+          <w:rFonts w:ascii="Calibri" w:hAnsi="Calibri" w:cs="Calibri"/>
+          <w:sz w:val="32"/>
+          <w:szCs w:val="32"/>
+          <w:lang w:val="es-MX"/>
+        </w:rPr>
+        <w:t>7</w:t>
+      </w:r>
+      <w:r>
+        <w:rPr>
+          <w:rFonts w:ascii="Calibri" w:hAnsi="Calibri" w:cs="Calibri"/>
+          <w:sz w:val="32"/>
+          <w:szCs w:val="32"/>
+          <w:lang w:val="es-MX"/>
+        </w:rPr>
+        <w:t>,000</w:t>
+      </w:r>
+    </w:p>
+    <w:p>
+      <w:pPr>
+        <w:rPr>
+          <w:rFonts w:ascii="Calibri" w:hAnsi="Calibri" w:cs="Calibri"/>
+          <w:sz w:val="32"/>
+          <w:szCs w:val="32"/>
+          <w:lang w:val="es-MX"/>
+        </w:rPr>
+      </w:pPr>
+      <w:r>
+        <w:rPr>
+          <w:rFonts w:ascii="Calibri" w:hAnsi="Calibri" w:cs="Calibri"/>
+          <w:sz w:val="32"/>
+          <w:szCs w:val="32"/>
+          <w:lang w:val="es-MX"/>
+        </w:rPr>
+        <w:t>3x Diagramadores</w:t>
+      </w:r>
+      <w:r>
+        <w:rPr>
+          <w:rFonts w:ascii="Calibri" w:hAnsi="Calibri" w:cs="Calibri"/>
+          <w:sz w:val="32"/>
+          <w:szCs w:val="32"/>
+          <w:lang w:val="es-MX"/>
+        </w:rPr>
+        <w:t xml:space="preserve"> </w:t>
+      </w:r>
+      <w:r>
+        <w:rPr>
+          <w:rFonts w:ascii="Calibri" w:hAnsi="Calibri" w:cs="Calibri"/>
+          <w:sz w:val="32"/>
+          <w:szCs w:val="32"/>
+          <w:lang w:val="es-MX"/>
+        </w:rPr>
+        <w:t xml:space="preserve">$3,000 </w:t>
+      </w:r>
+      <w:r>
+        <w:rPr>
+          <w:rFonts w:ascii="Calibri" w:hAnsi="Calibri" w:cs="Calibri"/>
+          <w:sz w:val="32"/>
+          <w:szCs w:val="32"/>
+          <w:lang w:val="es-MX"/>
+        </w:rPr>
+        <w:t>c/u</w:t>
+      </w:r>
+    </w:p>
+    <w:p>
+      <w:pPr>
+        <w:rPr>
+          <w:rFonts w:ascii="Calibri" w:hAnsi="Calibri" w:cs="Calibri"/>
+          <w:sz w:val="32"/>
+          <w:szCs w:val="32"/>
+          <w:lang w:val="es-MX"/>
+        </w:rPr>
+      </w:pPr>
+      <w:r>
+        <w:rPr>
+          <w:rFonts w:ascii="Calibri" w:hAnsi="Calibri" w:cs="Calibri"/>
+          <w:sz w:val="32"/>
+          <w:szCs w:val="32"/>
+          <w:lang w:val="es-MX"/>
+        </w:rPr>
+        <w:t xml:space="preserve">3x Documentadores técnicos </w:t>
+      </w:r>
+      <w:r>
+        <w:rPr>
+          <w:rFonts w:ascii="Calibri" w:hAnsi="Calibri" w:cs="Calibri"/>
+          <w:sz w:val="32"/>
+          <w:szCs w:val="32"/>
+          <w:lang w:val="es-MX"/>
+        </w:rPr>
+        <w:t>y manuales</w:t>
+      </w:r>
+      <w:r>
+        <w:rPr>
+          <w:rFonts w:ascii="Calibri" w:hAnsi="Calibri" w:cs="Calibri"/>
+          <w:sz w:val="32"/>
+          <w:szCs w:val="32"/>
+          <w:lang w:val="es-MX"/>
+        </w:rPr>
+        <w:t xml:space="preserve"> </w:t>
+      </w:r>
+      <w:r>
+        <w:rPr>
+          <w:rFonts w:ascii="Calibri" w:hAnsi="Calibri" w:cs="Calibri"/>
+          <w:sz w:val="32"/>
+          <w:szCs w:val="32"/>
+          <w:lang w:val="es-MX"/>
+        </w:rPr>
+        <w:t>$4,000</w:t>
+      </w:r>
+      <w:r>
+        <w:rPr>
+          <w:rFonts w:ascii="Calibri" w:hAnsi="Calibri" w:cs="Calibri"/>
+          <w:sz w:val="32"/>
+          <w:szCs w:val="32"/>
+          <w:lang w:val="es-MX"/>
+        </w:rPr>
+        <w:t xml:space="preserve"> c/u</w:t>
+      </w:r>
+    </w:p>
+    <w:p>
+      <w:pPr>
+        <w:rPr>
+          <w:rFonts w:ascii="Calibri" w:hAnsi="Calibri" w:cs="Calibri"/>
+          <w:sz w:val="32"/>
+          <w:szCs w:val="32"/>
+          <w:lang w:val="es-MX"/>
+        </w:rPr>
+      </w:pPr>
+      <w:r>
+        <w:rPr>
+          <w:rFonts w:ascii="Calibri" w:hAnsi="Calibri" w:cs="Calibri"/>
+          <w:sz w:val="32"/>
+          <w:szCs w:val="32"/>
+          <w:lang w:val="es-MX"/>
+        </w:rPr>
+        <w:t>Testing y depuración</w:t>
+      </w:r>
+      <w:r>
+        <w:rPr>
+          <w:rFonts w:ascii="Calibri" w:hAnsi="Calibri" w:cs="Calibri"/>
+          <w:sz w:val="32"/>
+          <w:szCs w:val="32"/>
+          <w:lang w:val="es-MX"/>
+        </w:rPr>
+        <w:t xml:space="preserve"> </w:t>
+      </w:r>
+      <w:r>
+        <w:rPr>
+          <w:rFonts w:ascii="Calibri" w:hAnsi="Calibri" w:cs="Calibri"/>
+          <w:sz w:val="32"/>
+          <w:szCs w:val="32"/>
+          <w:lang w:val="es-MX"/>
+        </w:rPr>
+        <w:t>$</w:t>
+      </w:r>
+      <w:r>
+        <w:rPr>
+          <w:rFonts w:ascii="Calibri" w:hAnsi="Calibri" w:cs="Calibri"/>
+          <w:sz w:val="32"/>
+          <w:szCs w:val="32"/>
+          <w:lang w:val="es-MX"/>
+        </w:rPr>
+        <w:t>7,000</w:t>
+      </w:r>
+    </w:p>
+    <w:p>
+      <w:pPr>
+        <w:rPr>
+          <w:rFonts w:ascii="Calibri" w:hAnsi="Calibri" w:cs="Calibri"/>
           <w:sz w:val="24"/>
           <w:szCs w:val="24"/>
           <w:lang w:val="es-MX"/>
         </w:rPr>
       </w:pPr>
+      <w:r>
+        <w:rPr>
+          <w:rFonts w:ascii="Calibri" w:hAnsi="Calibri" w:cs="Calibri"/>
+          <w:sz w:val="32"/>
+          <w:szCs w:val="32"/>
+          <w:lang w:val="es-MX"/>
+        </w:rPr>
+        <w:t>Líder de proyecto / revisión técnica</w:t>
+      </w:r>
+      <w:r>
+        <w:rPr>
+          <w:rFonts w:ascii="Calibri" w:hAnsi="Calibri" w:cs="Calibri"/>
+          <w:sz w:val="32"/>
+          <w:szCs w:val="32"/>
+          <w:lang w:val="es-MX"/>
+        </w:rPr>
+        <w:t xml:space="preserve"> </w:t>
+      </w:r>
+      <w:r>
+        <w:rPr>
+          <w:rFonts w:ascii="Calibri" w:hAnsi="Calibri" w:cs="Calibri"/>
+          <w:sz w:val="32"/>
+          <w:szCs w:val="32"/>
+          <w:lang w:val="es-MX"/>
+        </w:rPr>
+        <w:t>$</w:t>
+      </w:r>
+      <w:r>
+        <w:rPr>
+          <w:rFonts w:ascii="Calibri" w:hAnsi="Calibri" w:cs="Calibri"/>
+          <w:sz w:val="32"/>
+          <w:szCs w:val="32"/>
+          <w:lang w:val="es-MX"/>
+        </w:rPr>
+        <w:t>8,000</w:t>
+      </w:r>
     </w:p>
     <w:sectPr>
       <w:headerReference w:type="default" r:id="rId10"/>
       <w:footerReference w:type="default" r:id="rId11"/>
-      <w:pgSz w:w="12240" w:h="15840" w:orient="portrait"/>
+      <w:pgSz w:w="12240" w:h="15840"/>
       <w:pgMar w:top="1440" w:right="1440" w:bottom="1440" w:left="1440" w:header="720" w:footer="720" w:gutter="0"/>
       <w:pgBorders w:offsetFrom="page">
-        <w:top w:val="single" w:color="auto" w:sz="4" w:space="24"/>
-        <w:left w:val="single" w:color="auto" w:sz="4" w:space="24"/>
-        <w:bottom w:val="single" w:color="auto" w:sz="4" w:space="24"/>
-        <w:right w:val="single" w:color="auto" w:sz="4" w:space="24"/>
+        <w:top w:val="single" w:sz="4" w:space="24" w:color="auto"/>
+        <w:left w:val="single" w:sz="4" w:space="24" w:color="auto"/>
+        <w:bottom w:val="single" w:sz="4" w:space="24" w:color="auto"/>
+        <w:right w:val="single" w:sz="4" w:space="24" w:color="auto"/>
       </w:pgBorders>
       <w:cols w:space="720"/>
       <w:docGrid w:linePitch="360"/>
@@ -4546,7 +4640,7 @@
         <w:ind w:left="720" w:hanging="360"/>
       </w:pPr>
       <w:rPr>
-        <w:rFonts w:hint="default" w:ascii="Symbol" w:hAnsi="Symbol"/>
+        <w:rFonts w:ascii="Symbol" w:hAnsi="Symbol" w:hint="default"/>
       </w:rPr>
     </w:lvl>
     <w:lvl w:ilvl="1" w:tplc="85A4624A">
@@ -4558,7 +4652,7 @@
         <w:ind w:left="1440" w:hanging="360"/>
       </w:pPr>
       <w:rPr>
-        <w:rFonts w:hint="default" w:ascii="Courier New" w:hAnsi="Courier New"/>
+        <w:rFonts w:ascii="Courier New" w:hAnsi="Courier New" w:hint="default"/>
       </w:rPr>
     </w:lvl>
     <w:lvl w:ilvl="2" w:tplc="3F02986E">
@@ -4570,7 +4664,7 @@
         <w:ind w:left="2160" w:hanging="360"/>
       </w:pPr>
       <w:rPr>
-        <w:rFonts w:hint="default" w:ascii="Wingdings" w:hAnsi="Wingdings"/>
+        <w:rFonts w:ascii="Wingdings" w:hAnsi="Wingdings" w:hint="default"/>
       </w:rPr>
     </w:lvl>
     <w:lvl w:ilvl="3" w:tplc="283A7DF4">
@@ -4582,7 +4676,7 @@
         <w:ind w:left="2880" w:hanging="360"/>
       </w:pPr>
       <w:rPr>
-        <w:rFonts w:hint="default" w:ascii="Symbol" w:hAnsi="Symbol"/>
+        <w:rFonts w:ascii="Symbol" w:hAnsi="Symbol" w:hint="default"/>
       </w:rPr>
     </w:lvl>
     <w:lvl w:ilvl="4" w:tplc="9BF2436C">
@@ -4594,7 +4688,7 @@
         <w:ind w:left="3600" w:hanging="360"/>
       </w:pPr>
       <w:rPr>
-        <w:rFonts w:hint="default" w:ascii="Courier New" w:hAnsi="Courier New"/>
+        <w:rFonts w:ascii="Courier New" w:hAnsi="Courier New" w:hint="default"/>
       </w:rPr>
     </w:lvl>
     <w:lvl w:ilvl="5" w:tplc="DEC856A8">
@@ -4606,7 +4700,7 @@
         <w:ind w:left="4320" w:hanging="360"/>
       </w:pPr>
       <w:rPr>
-        <w:rFonts w:hint="default" w:ascii="Wingdings" w:hAnsi="Wingdings"/>
+        <w:rFonts w:ascii="Wingdings" w:hAnsi="Wingdings" w:hint="default"/>
       </w:rPr>
     </w:lvl>
     <w:lvl w:ilvl="6" w:tplc="F9885940">
@@ -4618,7 +4712,7 @@
         <w:ind w:left="5040" w:hanging="360"/>
       </w:pPr>
       <w:rPr>
-        <w:rFonts w:hint="default" w:ascii="Symbol" w:hAnsi="Symbol"/>
+        <w:rFonts w:ascii="Symbol" w:hAnsi="Symbol" w:hint="default"/>
       </w:rPr>
     </w:lvl>
     <w:lvl w:ilvl="7" w:tplc="82346B56">
@@ -4630,7 +4724,7 @@
         <w:ind w:left="5760" w:hanging="360"/>
       </w:pPr>
       <w:rPr>
-        <w:rFonts w:hint="default" w:ascii="Courier New" w:hAnsi="Courier New"/>
+        <w:rFonts w:ascii="Courier New" w:hAnsi="Courier New" w:hint="default"/>
       </w:rPr>
     </w:lvl>
     <w:lvl w:ilvl="8" w:tplc="34DA0BB2">
@@ -4642,7 +4736,7 @@
         <w:ind w:left="6480" w:hanging="360"/>
       </w:pPr>
       <w:rPr>
-        <w:rFonts w:hint="default" w:ascii="Wingdings" w:hAnsi="Wingdings"/>
+        <w:rFonts w:ascii="Wingdings" w:hAnsi="Wingdings" w:hint="default"/>
       </w:rPr>
     </w:lvl>
   </w:abstractNum>
@@ -4659,7 +4753,7 @@
         <w:ind w:left="720" w:hanging="360"/>
       </w:pPr>
       <w:rPr>
-        <w:rFonts w:hint="default" w:ascii="Symbol" w:hAnsi="Symbol"/>
+        <w:rFonts w:ascii="Symbol" w:hAnsi="Symbol" w:hint="default"/>
       </w:rPr>
     </w:lvl>
     <w:lvl w:ilvl="1" w:tplc="C7A0C8D2">
@@ -4671,7 +4765,7 @@
         <w:ind w:left="1440" w:hanging="360"/>
       </w:pPr>
       <w:rPr>
-        <w:rFonts w:hint="default" w:ascii="Courier New" w:hAnsi="Courier New"/>
+        <w:rFonts w:ascii="Courier New" w:hAnsi="Courier New" w:hint="default"/>
       </w:rPr>
     </w:lvl>
     <w:lvl w:ilvl="2" w:tplc="AADE8006">
@@ -4683,7 +4777,7 @@
         <w:ind w:left="2160" w:hanging="360"/>
       </w:pPr>
       <w:rPr>
-        <w:rFonts w:hint="default" w:ascii="Wingdings" w:hAnsi="Wingdings"/>
+        <w:rFonts w:ascii="Wingdings" w:hAnsi="Wingdings" w:hint="default"/>
       </w:rPr>
     </w:lvl>
     <w:lvl w:ilvl="3" w:tplc="FF04D9D0">
@@ -4695,7 +4789,7 @@
         <w:ind w:left="2880" w:hanging="360"/>
       </w:pPr>
       <w:rPr>
-        <w:rFonts w:hint="default" w:ascii="Symbol" w:hAnsi="Symbol"/>
+        <w:rFonts w:ascii="Symbol" w:hAnsi="Symbol" w:hint="default"/>
       </w:rPr>
     </w:lvl>
     <w:lvl w:ilvl="4" w:tplc="9954BAE0">
@@ -4707,7 +4801,7 @@
         <w:ind w:left="3600" w:hanging="360"/>
       </w:pPr>
       <w:rPr>
-        <w:rFonts w:hint="default" w:ascii="Courier New" w:hAnsi="Courier New"/>
+        <w:rFonts w:ascii="Courier New" w:hAnsi="Courier New" w:hint="default"/>
       </w:rPr>
     </w:lvl>
     <w:lvl w:ilvl="5" w:tplc="93CECCCE">
@@ -4719,7 +4813,7 @@
         <w:ind w:left="4320" w:hanging="360"/>
       </w:pPr>
       <w:rPr>
-        <w:rFonts w:hint="default" w:ascii="Wingdings" w:hAnsi="Wingdings"/>
+        <w:rFonts w:ascii="Wingdings" w:hAnsi="Wingdings" w:hint="default"/>
       </w:rPr>
     </w:lvl>
     <w:lvl w:ilvl="6" w:tplc="9B62A33A">
@@ -4731,7 +4825,7 @@
         <w:ind w:left="5040" w:hanging="360"/>
       </w:pPr>
       <w:rPr>
-        <w:rFonts w:hint="default" w:ascii="Symbol" w:hAnsi="Symbol"/>
+        <w:rFonts w:ascii="Symbol" w:hAnsi="Symbol" w:hint="default"/>
       </w:rPr>
     </w:lvl>
     <w:lvl w:ilvl="7" w:tplc="6FE6434A">
@@ -4743,7 +4837,7 @@
         <w:ind w:left="5760" w:hanging="360"/>
       </w:pPr>
       <w:rPr>
-        <w:rFonts w:hint="default" w:ascii="Courier New" w:hAnsi="Courier New"/>
+        <w:rFonts w:ascii="Courier New" w:hAnsi="Courier New" w:hint="default"/>
       </w:rPr>
     </w:lvl>
     <w:lvl w:ilvl="8" w:tplc="E5547A92">
@@ -4755,7 +4849,7 @@
         <w:ind w:left="6480" w:hanging="360"/>
       </w:pPr>
       <w:rPr>
-        <w:rFonts w:hint="default" w:ascii="Wingdings" w:hAnsi="Wingdings"/>
+        <w:rFonts w:ascii="Wingdings" w:hAnsi="Wingdings" w:hint="default"/>
       </w:rPr>
     </w:lvl>
   </w:abstractNum>
@@ -4772,7 +4866,7 @@
         <w:ind w:left="720" w:hanging="360"/>
       </w:pPr>
       <w:rPr>
-        <w:rFonts w:hint="default" w:ascii="Wingdings" w:hAnsi="Wingdings"/>
+        <w:rFonts w:ascii="Wingdings" w:hAnsi="Wingdings" w:hint="default"/>
       </w:rPr>
     </w:lvl>
     <w:lvl w:ilvl="1" w:tplc="53FC633A">
@@ -4784,7 +4878,7 @@
         <w:ind w:left="1440" w:hanging="360"/>
       </w:pPr>
       <w:rPr>
-        <w:rFonts w:hint="default" w:ascii="Courier New" w:hAnsi="Courier New"/>
+        <w:rFonts w:ascii="Courier New" w:hAnsi="Courier New" w:hint="default"/>
       </w:rPr>
     </w:lvl>
     <w:lvl w:ilvl="2" w:tplc="475E428A">
@@ -4796,7 +4890,7 @@
         <w:ind w:left="2160" w:hanging="360"/>
       </w:pPr>
       <w:rPr>
-        <w:rFonts w:hint="default" w:ascii="Wingdings" w:hAnsi="Wingdings"/>
+        <w:rFonts w:ascii="Wingdings" w:hAnsi="Wingdings" w:hint="default"/>
       </w:rPr>
     </w:lvl>
     <w:lvl w:ilvl="3" w:tplc="29F60574">
@@ -4808,7 +4902,7 @@
         <w:ind w:left="2880" w:hanging="360"/>
       </w:pPr>
       <w:rPr>
-        <w:rFonts w:hint="default" w:ascii="Symbol" w:hAnsi="Symbol"/>
+        <w:rFonts w:ascii="Symbol" w:hAnsi="Symbol" w:hint="default"/>
       </w:rPr>
     </w:lvl>
     <w:lvl w:ilvl="4" w:tplc="AC38767C">
@@ -4820,7 +4914,7 @@
         <w:ind w:left="3600" w:hanging="360"/>
       </w:pPr>
       <w:rPr>
-        <w:rFonts w:hint="default" w:ascii="Courier New" w:hAnsi="Courier New"/>
+        <w:rFonts w:ascii="Courier New" w:hAnsi="Courier New" w:hint="default"/>
       </w:rPr>
     </w:lvl>
     <w:lvl w:ilvl="5" w:tplc="EBDA9036">
@@ -4832,7 +4926,7 @@
         <w:ind w:left="4320" w:hanging="360"/>
       </w:pPr>
       <w:rPr>
-        <w:rFonts w:hint="default" w:ascii="Wingdings" w:hAnsi="Wingdings"/>
+        <w:rFonts w:ascii="Wingdings" w:hAnsi="Wingdings" w:hint="default"/>
       </w:rPr>
     </w:lvl>
     <w:lvl w:ilvl="6" w:tplc="EBBE5CE0">
@@ -4844,7 +4938,7 @@
         <w:ind w:left="5040" w:hanging="360"/>
       </w:pPr>
       <w:rPr>
-        <w:rFonts w:hint="default" w:ascii="Symbol" w:hAnsi="Symbol"/>
+        <w:rFonts w:ascii="Symbol" w:hAnsi="Symbol" w:hint="default"/>
       </w:rPr>
     </w:lvl>
     <w:lvl w:ilvl="7" w:tplc="72D860C6">
@@ -4856,7 +4950,7 @@
         <w:ind w:left="5760" w:hanging="360"/>
       </w:pPr>
       <w:rPr>
-        <w:rFonts w:hint="default" w:ascii="Courier New" w:hAnsi="Courier New"/>
+        <w:rFonts w:ascii="Courier New" w:hAnsi="Courier New" w:hint="default"/>
       </w:rPr>
     </w:lvl>
     <w:lvl w:ilvl="8" w:tplc="03AC604E">
@@ -4868,7 +4962,7 @@
         <w:ind w:left="6480" w:hanging="360"/>
       </w:pPr>
       <w:rPr>
-        <w:rFonts w:hint="default" w:ascii="Wingdings" w:hAnsi="Wingdings"/>
+        <w:rFonts w:ascii="Wingdings" w:hAnsi="Wingdings" w:hint="default"/>
       </w:rPr>
     </w:lvl>
   </w:abstractNum>
@@ -4885,7 +4979,7 @@
         <w:ind w:left="720" w:hanging="360"/>
       </w:pPr>
       <w:rPr>
-        <w:rFonts w:hint="default" w:ascii="Symbol" w:hAnsi="Symbol"/>
+        <w:rFonts w:ascii="Symbol" w:hAnsi="Symbol" w:hint="default"/>
       </w:rPr>
     </w:lvl>
     <w:lvl w:ilvl="1" w:tplc="080A0003" w:tentative="1">
@@ -4897,7 +4991,7 @@
         <w:ind w:left="1440" w:hanging="360"/>
       </w:pPr>
       <w:rPr>
-        <w:rFonts w:hint="default" w:ascii="Courier New" w:hAnsi="Courier New" w:cs="Courier New"/>
+        <w:rFonts w:ascii="Courier New" w:hAnsi="Courier New" w:cs="Courier New" w:hint="default"/>
       </w:rPr>
     </w:lvl>
     <w:lvl w:ilvl="2" w:tplc="080A0005" w:tentative="1">
@@ -4909,7 +5003,7 @@
         <w:ind w:left="2160" w:hanging="360"/>
       </w:pPr>
       <w:rPr>
-        <w:rFonts w:hint="default" w:ascii="Wingdings" w:hAnsi="Wingdings"/>
+        <w:rFonts w:ascii="Wingdings" w:hAnsi="Wingdings" w:hint="default"/>
       </w:rPr>
     </w:lvl>
     <w:lvl w:ilvl="3" w:tplc="080A0001" w:tentative="1">
@@ -4921,7 +5015,7 @@
         <w:ind w:left="2880" w:hanging="360"/>
       </w:pPr>
       <w:rPr>
-        <w:rFonts w:hint="default" w:ascii="Symbol" w:hAnsi="Symbol"/>
+        <w:rFonts w:ascii="Symbol" w:hAnsi="Symbol" w:hint="default"/>
       </w:rPr>
     </w:lvl>
     <w:lvl w:ilvl="4" w:tplc="080A0003" w:tentative="1">
@@ -4933,7 +5027,7 @@
         <w:ind w:left="3600" w:hanging="360"/>
       </w:pPr>
       <w:rPr>
-        <w:rFonts w:hint="default" w:ascii="Courier New" w:hAnsi="Courier New" w:cs="Courier New"/>
+        <w:rFonts w:ascii="Courier New" w:hAnsi="Courier New" w:cs="Courier New" w:hint="default"/>
       </w:rPr>
     </w:lvl>
     <w:lvl w:ilvl="5" w:tplc="080A0005" w:tentative="1">
@@ -4945,7 +5039,7 @@
         <w:ind w:left="4320" w:hanging="360"/>
       </w:pPr>
       <w:rPr>
-        <w:rFonts w:hint="default" w:ascii="Wingdings" w:hAnsi="Wingdings"/>
+        <w:rFonts w:ascii="Wingdings" w:hAnsi="Wingdings" w:hint="default"/>
       </w:rPr>
     </w:lvl>
     <w:lvl w:ilvl="6" w:tplc="080A0001" w:tentative="1">
@@ -4957,7 +5051,7 @@
         <w:ind w:left="5040" w:hanging="360"/>
       </w:pPr>
       <w:rPr>
-        <w:rFonts w:hint="default" w:ascii="Symbol" w:hAnsi="Symbol"/>
+        <w:rFonts w:ascii="Symbol" w:hAnsi="Symbol" w:hint="default"/>
       </w:rPr>
     </w:lvl>
     <w:lvl w:ilvl="7" w:tplc="080A0003" w:tentative="1">
@@ -4969,7 +5063,7 @@
         <w:ind w:left="5760" w:hanging="360"/>
       </w:pPr>
       <w:rPr>
-        <w:rFonts w:hint="default" w:ascii="Courier New" w:hAnsi="Courier New" w:cs="Courier New"/>
+        <w:rFonts w:ascii="Courier New" w:hAnsi="Courier New" w:cs="Courier New" w:hint="default"/>
       </w:rPr>
     </w:lvl>
     <w:lvl w:ilvl="8" w:tplc="080A0005" w:tentative="1">
@@ -4981,7 +5075,7 @@
         <w:ind w:left="6480" w:hanging="360"/>
       </w:pPr>
       <w:rPr>
-        <w:rFonts w:hint="default" w:ascii="Wingdings" w:hAnsi="Wingdings"/>
+        <w:rFonts w:ascii="Wingdings" w:hAnsi="Wingdings" w:hint="default"/>
       </w:rPr>
     </w:lvl>
   </w:abstractNum>
@@ -4998,7 +5092,7 @@
         <w:ind w:left="720" w:hanging="360"/>
       </w:pPr>
       <w:rPr>
-        <w:rFonts w:hint="default" w:ascii="Courier New" w:hAnsi="Courier New"/>
+        <w:rFonts w:ascii="Courier New" w:hAnsi="Courier New" w:hint="default"/>
       </w:rPr>
     </w:lvl>
     <w:lvl w:ilvl="1" w:tplc="900C8D36">
@@ -5010,7 +5104,7 @@
         <w:ind w:left="1440" w:hanging="360"/>
       </w:pPr>
       <w:rPr>
-        <w:rFonts w:hint="default" w:ascii="Courier New" w:hAnsi="Courier New"/>
+        <w:rFonts w:ascii="Courier New" w:hAnsi="Courier New" w:hint="default"/>
       </w:rPr>
     </w:lvl>
     <w:lvl w:ilvl="2" w:tplc="CB7A7D32">
@@ -5022,7 +5116,7 @@
         <w:ind w:left="2160" w:hanging="360"/>
       </w:pPr>
       <w:rPr>
-        <w:rFonts w:hint="default" w:ascii="Wingdings" w:hAnsi="Wingdings"/>
+        <w:rFonts w:ascii="Wingdings" w:hAnsi="Wingdings" w:hint="default"/>
       </w:rPr>
     </w:lvl>
     <w:lvl w:ilvl="3" w:tplc="48E008F4">
@@ -5034,7 +5128,7 @@
         <w:ind w:left="2880" w:hanging="360"/>
       </w:pPr>
       <w:rPr>
-        <w:rFonts w:hint="default" w:ascii="Symbol" w:hAnsi="Symbol"/>
+        <w:rFonts w:ascii="Symbol" w:hAnsi="Symbol" w:hint="default"/>
       </w:rPr>
     </w:lvl>
     <w:lvl w:ilvl="4" w:tplc="BAECA1F6">
@@ -5046,7 +5140,7 @@
         <w:ind w:left="3600" w:hanging="360"/>
       </w:pPr>
       <w:rPr>
-        <w:rFonts w:hint="default" w:ascii="Courier New" w:hAnsi="Courier New"/>
+        <w:rFonts w:ascii="Courier New" w:hAnsi="Courier New" w:hint="default"/>
       </w:rPr>
     </w:lvl>
     <w:lvl w:ilvl="5" w:tplc="F97A4AA6">
@@ -5058,7 +5152,7 @@
         <w:ind w:left="4320" w:hanging="360"/>
       </w:pPr>
       <w:rPr>
-        <w:rFonts w:hint="default" w:ascii="Wingdings" w:hAnsi="Wingdings"/>
+        <w:rFonts w:ascii="Wingdings" w:hAnsi="Wingdings" w:hint="default"/>
       </w:rPr>
     </w:lvl>
     <w:lvl w:ilvl="6" w:tplc="2C007C1C">
@@ -5070,7 +5164,7 @@
         <w:ind w:left="5040" w:hanging="360"/>
       </w:pPr>
       <w:rPr>
-        <w:rFonts w:hint="default" w:ascii="Symbol" w:hAnsi="Symbol"/>
+        <w:rFonts w:ascii="Symbol" w:hAnsi="Symbol" w:hint="default"/>
       </w:rPr>
     </w:lvl>
     <w:lvl w:ilvl="7" w:tplc="D23CF288">
@@ -5082,7 +5176,7 @@
         <w:ind w:left="5760" w:hanging="360"/>
       </w:pPr>
       <w:rPr>
-        <w:rFonts w:hint="default" w:ascii="Courier New" w:hAnsi="Courier New"/>
+        <w:rFonts w:ascii="Courier New" w:hAnsi="Courier New" w:hint="default"/>
       </w:rPr>
     </w:lvl>
     <w:lvl w:ilvl="8" w:tplc="16984808">
@@ -5094,7 +5188,7 @@
         <w:ind w:left="6480" w:hanging="360"/>
       </w:pPr>
       <w:rPr>
-        <w:rFonts w:hint="default" w:ascii="Wingdings" w:hAnsi="Wingdings"/>
+        <w:rFonts w:ascii="Wingdings" w:hAnsi="Wingdings" w:hint="default"/>
       </w:rPr>
     </w:lvl>
   </w:abstractNum>
@@ -5111,7 +5205,7 @@
         <w:ind w:left="720" w:hanging="360"/>
       </w:pPr>
       <w:rPr>
-        <w:rFonts w:hint="default" w:ascii="Calibri" w:hAnsi="Calibri"/>
+        <w:rFonts w:ascii="Calibri" w:hAnsi="Calibri" w:hint="default"/>
       </w:rPr>
     </w:lvl>
     <w:lvl w:ilvl="1" w:tplc="A0A20E4A">
@@ -5123,7 +5217,7 @@
         <w:ind w:left="1440" w:hanging="360"/>
       </w:pPr>
       <w:rPr>
-        <w:rFonts w:hint="default" w:ascii="Courier New" w:hAnsi="Courier New"/>
+        <w:rFonts w:ascii="Courier New" w:hAnsi="Courier New" w:hint="default"/>
       </w:rPr>
     </w:lvl>
     <w:lvl w:ilvl="2" w:tplc="783CF1EC">
@@ -5135,7 +5229,7 @@
         <w:ind w:left="2160" w:hanging="360"/>
       </w:pPr>
       <w:rPr>
-        <w:rFonts w:hint="default" w:ascii="Wingdings" w:hAnsi="Wingdings"/>
+        <w:rFonts w:ascii="Wingdings" w:hAnsi="Wingdings" w:hint="default"/>
       </w:rPr>
     </w:lvl>
     <w:lvl w:ilvl="3" w:tplc="97C254F0">
@@ -5147,7 +5241,7 @@
         <w:ind w:left="2880" w:hanging="360"/>
       </w:pPr>
       <w:rPr>
-        <w:rFonts w:hint="default" w:ascii="Symbol" w:hAnsi="Symbol"/>
+        <w:rFonts w:ascii="Symbol" w:hAnsi="Symbol" w:hint="default"/>
       </w:rPr>
     </w:lvl>
     <w:lvl w:ilvl="4" w:tplc="E34EC8C6">
@@ -5159,7 +5253,7 @@
         <w:ind w:left="3600" w:hanging="360"/>
       </w:pPr>
       <w:rPr>
-        <w:rFonts w:hint="default" w:ascii="Courier New" w:hAnsi="Courier New"/>
+        <w:rFonts w:ascii="Courier New" w:hAnsi="Courier New" w:hint="default"/>
       </w:rPr>
     </w:lvl>
     <w:lvl w:ilvl="5" w:tplc="10609A2C">
@@ -5171,7 +5265,7 @@
         <w:ind w:left="4320" w:hanging="360"/>
       </w:pPr>
       <w:rPr>
-        <w:rFonts w:hint="default" w:ascii="Wingdings" w:hAnsi="Wingdings"/>
+        <w:rFonts w:ascii="Wingdings" w:hAnsi="Wingdings" w:hint="default"/>
       </w:rPr>
     </w:lvl>
     <w:lvl w:ilvl="6" w:tplc="231AF29A">
@@ -5183,7 +5277,7 @@
         <w:ind w:left="5040" w:hanging="360"/>
       </w:pPr>
       <w:rPr>
-        <w:rFonts w:hint="default" w:ascii="Symbol" w:hAnsi="Symbol"/>
+        <w:rFonts w:ascii="Symbol" w:hAnsi="Symbol" w:hint="default"/>
       </w:rPr>
     </w:lvl>
     <w:lvl w:ilvl="7" w:tplc="9DB0E070">
@@ -5195,7 +5289,7 @@
         <w:ind w:left="5760" w:hanging="360"/>
       </w:pPr>
       <w:rPr>
-        <w:rFonts w:hint="default" w:ascii="Courier New" w:hAnsi="Courier New"/>
+        <w:rFonts w:ascii="Courier New" w:hAnsi="Courier New" w:hint="default"/>
       </w:rPr>
     </w:lvl>
     <w:lvl w:ilvl="8" w:tplc="E3C0D7BA">
@@ -5207,7 +5301,7 @@
         <w:ind w:left="6480" w:hanging="360"/>
       </w:pPr>
       <w:rPr>
-        <w:rFonts w:hint="default" w:ascii="Wingdings" w:hAnsi="Wingdings"/>
+        <w:rFonts w:ascii="Wingdings" w:hAnsi="Wingdings" w:hint="default"/>
       </w:rPr>
     </w:lvl>
   </w:abstractNum>
@@ -5224,7 +5318,7 @@
         <w:ind w:left="720" w:hanging="360"/>
       </w:pPr>
       <w:rPr>
-        <w:rFonts w:hint="default" w:ascii="Courier New" w:hAnsi="Courier New"/>
+        <w:rFonts w:ascii="Courier New" w:hAnsi="Courier New" w:hint="default"/>
       </w:rPr>
     </w:lvl>
     <w:lvl w:ilvl="1" w:tplc="949A4B4E">
@@ -5236,7 +5330,7 @@
         <w:ind w:left="1440" w:hanging="360"/>
       </w:pPr>
       <w:rPr>
-        <w:rFonts w:hint="default" w:ascii="Courier New" w:hAnsi="Courier New"/>
+        <w:rFonts w:ascii="Courier New" w:hAnsi="Courier New" w:hint="default"/>
       </w:rPr>
     </w:lvl>
     <w:lvl w:ilvl="2" w:tplc="45D20A94">
@@ -5248,7 +5342,7 @@
         <w:ind w:left="2160" w:hanging="360"/>
       </w:pPr>
       <w:rPr>
-        <w:rFonts w:hint="default" w:ascii="Wingdings" w:hAnsi="Wingdings"/>
+        <w:rFonts w:ascii="Wingdings" w:hAnsi="Wingdings" w:hint="default"/>
       </w:rPr>
     </w:lvl>
     <w:lvl w:ilvl="3" w:tplc="2628184E">
@@ -5260,7 +5354,7 @@
         <w:ind w:left="2880" w:hanging="360"/>
       </w:pPr>
       <w:rPr>
-        <w:rFonts w:hint="default" w:ascii="Symbol" w:hAnsi="Symbol"/>
+        <w:rFonts w:ascii="Symbol" w:hAnsi="Symbol" w:hint="default"/>
       </w:rPr>
     </w:lvl>
     <w:lvl w:ilvl="4" w:tplc="F1CC9E36">
@@ -5272,7 +5366,7 @@
         <w:ind w:left="3600" w:hanging="360"/>
       </w:pPr>
       <w:rPr>
-        <w:rFonts w:hint="default" w:ascii="Courier New" w:hAnsi="Courier New"/>
+        <w:rFonts w:ascii="Courier New" w:hAnsi="Courier New" w:hint="default"/>
       </w:rPr>
     </w:lvl>
     <w:lvl w:ilvl="5" w:tplc="F4F86970">
@@ -5284,7 +5378,7 @@
         <w:ind w:left="4320" w:hanging="360"/>
       </w:pPr>
       <w:rPr>
-        <w:rFonts w:hint="default" w:ascii="Wingdings" w:hAnsi="Wingdings"/>
+        <w:rFonts w:ascii="Wingdings" w:hAnsi="Wingdings" w:hint="default"/>
       </w:rPr>
     </w:lvl>
     <w:lvl w:ilvl="6" w:tplc="62E2DFBC">
@@ -5296,7 +5390,7 @@
         <w:ind w:left="5040" w:hanging="360"/>
       </w:pPr>
       <w:rPr>
-        <w:rFonts w:hint="default" w:ascii="Symbol" w:hAnsi="Symbol"/>
+        <w:rFonts w:ascii="Symbol" w:hAnsi="Symbol" w:hint="default"/>
       </w:rPr>
     </w:lvl>
     <w:lvl w:ilvl="7" w:tplc="F41C9000">
@@ -5308,7 +5402,7 @@
         <w:ind w:left="5760" w:hanging="360"/>
       </w:pPr>
       <w:rPr>
-        <w:rFonts w:hint="default" w:ascii="Courier New" w:hAnsi="Courier New"/>
+        <w:rFonts w:ascii="Courier New" w:hAnsi="Courier New" w:hint="default"/>
       </w:rPr>
     </w:lvl>
     <w:lvl w:ilvl="8" w:tplc="DDD014C2">
@@ -5320,7 +5414,7 @@
         <w:ind w:left="6480" w:hanging="360"/>
       </w:pPr>
       <w:rPr>
-        <w:rFonts w:hint="default" w:ascii="Wingdings" w:hAnsi="Wingdings"/>
+        <w:rFonts w:ascii="Wingdings" w:hAnsi="Wingdings" w:hint="default"/>
       </w:rPr>
     </w:lvl>
   </w:abstractNum>
@@ -5353,7 +5447,7 @@
   <w:docDefaults>
     <w:rPrDefault>
       <w:rPr>
-        <w:rFonts w:asciiTheme="minorHAnsi" w:hAnsiTheme="minorHAnsi" w:eastAsiaTheme="minorHAnsi" w:cstheme="minorBidi"/>
+        <w:rFonts w:asciiTheme="minorHAnsi" w:eastAsiaTheme="minorHAnsi" w:hAnsiTheme="minorHAnsi" w:cstheme="minorBidi"/>
         <w:kern w:val="2"/>
         <w:sz w:val="22"/>
         <w:szCs w:val="22"/>
@@ -5370,14 +5464,14 @@
   <w:latentStyles w:defLockedState="0" w:defUIPriority="99" w:defSemiHidden="0" w:defUnhideWhenUsed="0" w:defQFormat="0" w:count="376">
     <w:lsdException w:name="Normal" w:uiPriority="0" w:qFormat="1"/>
     <w:lsdException w:name="heading 1" w:uiPriority="9" w:qFormat="1"/>
-    <w:lsdException w:name="heading 2" w:uiPriority="9" w:semiHidden="1" w:unhideWhenUsed="1" w:qFormat="1"/>
-    <w:lsdException w:name="heading 3" w:uiPriority="9" w:semiHidden="1" w:unhideWhenUsed="1" w:qFormat="1"/>
-    <w:lsdException w:name="heading 4" w:uiPriority="9" w:semiHidden="1" w:unhideWhenUsed="1" w:qFormat="1"/>
-    <w:lsdException w:name="heading 5" w:uiPriority="9" w:semiHidden="1" w:unhideWhenUsed="1" w:qFormat="1"/>
-    <w:lsdException w:name="heading 6" w:uiPriority="9" w:semiHidden="1" w:unhideWhenUsed="1" w:qFormat="1"/>
-    <w:lsdException w:name="heading 7" w:uiPriority="9" w:semiHidden="1" w:unhideWhenUsed="1" w:qFormat="1"/>
-    <w:lsdException w:name="heading 8" w:uiPriority="9" w:semiHidden="1" w:unhideWhenUsed="1" w:qFormat="1"/>
-    <w:lsdException w:name="heading 9" w:uiPriority="9" w:semiHidden="1" w:unhideWhenUsed="1" w:qFormat="1"/>
+    <w:lsdException w:name="heading 2" w:semiHidden="1" w:uiPriority="9" w:unhideWhenUsed="1" w:qFormat="1"/>
+    <w:lsdException w:name="heading 3" w:semiHidden="1" w:uiPriority="9" w:unhideWhenUsed="1" w:qFormat="1"/>
+    <w:lsdException w:name="heading 4" w:semiHidden="1" w:uiPriority="9" w:unhideWhenUsed="1" w:qFormat="1"/>
+    <w:lsdException w:name="heading 5" w:semiHidden="1" w:uiPriority="9" w:unhideWhenUsed="1" w:qFormat="1"/>
+    <w:lsdException w:name="heading 6" w:semiHidden="1" w:uiPriority="9" w:unhideWhenUsed="1" w:qFormat="1"/>
+    <w:lsdException w:name="heading 7" w:semiHidden="1" w:uiPriority="9" w:unhideWhenUsed="1" w:qFormat="1"/>
+    <w:lsdException w:name="heading 8" w:semiHidden="1" w:uiPriority="9" w:unhideWhenUsed="1" w:qFormat="1"/>
+    <w:lsdException w:name="heading 9" w:semiHidden="1" w:uiPriority="9" w:unhideWhenUsed="1" w:qFormat="1"/>
     <w:lsdException w:name="index 1" w:semiHidden="1" w:unhideWhenUsed="1"/>
     <w:lsdException w:name="index 2" w:semiHidden="1" w:unhideWhenUsed="1"/>
     <w:lsdException w:name="index 3" w:semiHidden="1" w:unhideWhenUsed="1"/>
@@ -5387,22 +5481,22 @@
     <w:lsdException w:name="index 7" w:semiHidden="1" w:unhideWhenUsed="1"/>
     <w:lsdException w:name="index 8" w:semiHidden="1" w:unhideWhenUsed="1"/>
     <w:lsdException w:name="index 9" w:semiHidden="1" w:unhideWhenUsed="1"/>
-    <w:lsdException w:name="toc 1" w:uiPriority="39" w:semiHidden="1" w:unhideWhenUsed="1"/>
-    <w:lsdException w:name="toc 2" w:uiPriority="39" w:semiHidden="1" w:unhideWhenUsed="1"/>
-    <w:lsdException w:name="toc 3" w:uiPriority="39" w:semiHidden="1" w:unhideWhenUsed="1"/>
-    <w:lsdException w:name="toc 4" w:uiPriority="39" w:semiHidden="1" w:unhideWhenUsed="1"/>
-    <w:lsdException w:name="toc 5" w:uiPriority="39" w:semiHidden="1" w:unhideWhenUsed="1"/>
-    <w:lsdException w:name="toc 6" w:uiPriority="39" w:semiHidden="1" w:unhideWhenUsed="1"/>
-    <w:lsdException w:name="toc 7" w:uiPriority="39" w:semiHidden="1" w:unhideWhenUsed="1"/>
-    <w:lsdException w:name="toc 8" w:uiPriority="39" w:semiHidden="1" w:unhideWhenUsed="1"/>
-    <w:lsdException w:name="toc 9" w:uiPriority="39" w:semiHidden="1" w:unhideWhenUsed="1"/>
+    <w:lsdException w:name="toc 1" w:semiHidden="1" w:uiPriority="39" w:unhideWhenUsed="1"/>
+    <w:lsdException w:name="toc 2" w:semiHidden="1" w:uiPriority="39" w:unhideWhenUsed="1"/>
+    <w:lsdException w:name="toc 3" w:semiHidden="1" w:uiPriority="39" w:unhideWhenUsed="1"/>
+    <w:lsdException w:name="toc 4" w:semiHidden="1" w:uiPriority="39" w:unhideWhenUsed="1"/>
+    <w:lsdException w:name="toc 5" w:semiHidden="1" w:uiPriority="39" w:unhideWhenUsed="1"/>
+    <w:lsdException w:name="toc 6" w:semiHidden="1" w:uiPriority="39" w:unhideWhenUsed="1"/>
+    <w:lsdException w:name="toc 7" w:semiHidden="1" w:uiPriority="39" w:unhideWhenUsed="1"/>
+    <w:lsdException w:name="toc 8" w:semiHidden="1" w:uiPriority="39" w:unhideWhenUsed="1"/>
+    <w:lsdException w:name="toc 9" w:semiHidden="1" w:uiPriority="39" w:unhideWhenUsed="1"/>
     <w:lsdException w:name="Normal Indent" w:semiHidden="1" w:unhideWhenUsed="1"/>
     <w:lsdException w:name="footnote text" w:semiHidden="1" w:unhideWhenUsed="1"/>
     <w:lsdException w:name="annotation text" w:semiHidden="1" w:unhideWhenUsed="1"/>
     <w:lsdException w:name="header" w:semiHidden="1" w:unhideWhenUsed="1"/>
     <w:lsdException w:name="footer" w:semiHidden="1" w:unhideWhenUsed="1"/>
     <w:lsdException w:name="index heading" w:semiHidden="1" w:unhideWhenUsed="1"/>
-    <w:lsdException w:name="caption" w:uiPriority="35" w:semiHidden="1" w:unhideWhenUsed="1" w:qFormat="1"/>
+    <w:lsdException w:name="caption" w:semiHidden="1" w:uiPriority="35" w:unhideWhenUsed="1" w:qFormat="1"/>
     <w:lsdException w:name="table of figures" w:semiHidden="1" w:unhideWhenUsed="1"/>
     <w:lsdException w:name="envelope address" w:semiHidden="1" w:unhideWhenUsed="1"/>
     <w:lsdException w:name="envelope return" w:semiHidden="1" w:unhideWhenUsed="1"/>
@@ -5433,7 +5527,7 @@
     <w:lsdException w:name="Title" w:uiPriority="10" w:qFormat="1"/>
     <w:lsdException w:name="Closing" w:semiHidden="1" w:unhideWhenUsed="1"/>
     <w:lsdException w:name="Signature" w:semiHidden="1" w:unhideWhenUsed="1"/>
-    <w:lsdException w:name="Default Paragraph Font" w:uiPriority="1" w:semiHidden="1" w:unhideWhenUsed="1"/>
+    <w:lsdException w:name="Default Paragraph Font" w:semiHidden="1" w:uiPriority="1" w:unhideWhenUsed="1"/>
     <w:lsdException w:name="Body Text" w:semiHidden="1" w:unhideWhenUsed="1"/>
     <w:lsdException w:name="Body Text Indent" w:semiHidden="1" w:unhideWhenUsed="1"/>
     <w:lsdException w:name="List Continue" w:semiHidden="1" w:unhideWhenUsed="1"/>
@@ -5633,8 +5727,8 @@
     <w:lsdException w:name="Subtle Reference" w:uiPriority="31" w:qFormat="1"/>
     <w:lsdException w:name="Intense Reference" w:uiPriority="32" w:qFormat="1"/>
     <w:lsdException w:name="Book Title" w:uiPriority="33" w:qFormat="1"/>
-    <w:lsdException w:name="Bibliography" w:uiPriority="37" w:semiHidden="1" w:unhideWhenUsed="1"/>
-    <w:lsdException w:name="TOC Heading" w:uiPriority="39" w:semiHidden="1" w:unhideWhenUsed="1" w:qFormat="1"/>
+    <w:lsdException w:name="Bibliography" w:semiHidden="1" w:uiPriority="37" w:unhideWhenUsed="1"/>
+    <w:lsdException w:name="TOC Heading" w:semiHidden="1" w:uiPriority="39" w:unhideWhenUsed="1" w:qFormat="1"/>
     <w:lsdException w:name="Plain Table 1" w:uiPriority="41"/>
     <w:lsdException w:name="Plain Table 2" w:uiPriority="42"/>
     <w:lsdException w:name="Plain Table 3" w:uiPriority="43"/>
@@ -5745,17 +5839,17 @@
     <w:lsdException w:name="Unresolved Mention" w:semiHidden="1" w:unhideWhenUsed="1"/>
     <w:lsdException w:name="Smart Link" w:semiHidden="1" w:unhideWhenUsed="1"/>
   </w:latentStyles>
-  <w:style w:type="paragraph" w:styleId="Normal" w:default="1">
+  <w:style w:type="paragraph" w:default="1" w:styleId="Normal">
     <w:name w:val="Normal"/>
     <w:qFormat/>
   </w:style>
-  <w:style w:type="character" w:styleId="DefaultParagraphFont" w:default="1">
+  <w:style w:type="character" w:default="1" w:styleId="DefaultParagraphFont">
     <w:name w:val="Default Paragraph Font"/>
     <w:uiPriority w:val="1"/>
     <w:semiHidden/>
     <w:unhideWhenUsed/>
   </w:style>
-  <w:style w:type="table" w:styleId="TableNormal" w:default="1">
+  <w:style w:type="table" w:default="1" w:styleId="TableNormal">
     <w:name w:val="Normal Table"/>
     <w:uiPriority w:val="99"/>
     <w:semiHidden/>
@@ -5770,7 +5864,7 @@
       </w:tblCellMar>
     </w:tblPr>
   </w:style>
-  <w:style w:type="numbering" w:styleId="NoList" w:default="1">
+  <w:style w:type="numbering" w:default="1" w:styleId="NoList">
     <w:name w:val="No List"/>
     <w:uiPriority w:val="99"/>
     <w:semiHidden/>
@@ -5792,7 +5886,7 @@
       <w:spacing w:after="0" w:line="240" w:lineRule="auto"/>
     </w:pPr>
   </w:style>
-  <w:style w:type="character" w:styleId="HeaderChar" w:customStyle="1">
+  <w:style w:type="character" w:customStyle="1" w:styleId="HeaderChar">
     <w:name w:val="Header Char"/>
     <w:basedOn w:val="DefaultParagraphFont"/>
     <w:link w:val="Header"/>
@@ -5816,7 +5910,7 @@
       <w:spacing w:after="0" w:line="240" w:lineRule="auto"/>
     </w:pPr>
   </w:style>
-  <w:style w:type="character" w:styleId="FooterChar" w:customStyle="1">
+  <w:style w:type="character" w:customStyle="1" w:styleId="FooterChar">
     <w:name w:val="Footer Char"/>
     <w:basedOn w:val="DefaultParagraphFont"/>
     <w:link w:val="Footer"/>
@@ -5834,12 +5928,12 @@
     </w:pPr>
     <w:tblPr>
       <w:tblBorders>
-        <w:top w:val="single" w:color="000000" w:themeColor="text1" w:sz="4" w:space="0"/>
-        <w:left w:val="single" w:color="000000" w:themeColor="text1" w:sz="4" w:space="0"/>
-        <w:bottom w:val="single" w:color="000000" w:themeColor="text1" w:sz="4" w:space="0"/>
-        <w:right w:val="single" w:color="000000" w:themeColor="text1" w:sz="4" w:space="0"/>
-        <w:insideH w:val="single" w:color="000000" w:themeColor="text1" w:sz="4" w:space="0"/>
-        <w:insideV w:val="single" w:color="000000" w:themeColor="text1" w:sz="4" w:space="0"/>
+        <w:top w:val="single" w:sz="4" w:space="0" w:color="000000" w:themeColor="text1"/>
+        <w:left w:val="single" w:sz="4" w:space="0" w:color="000000" w:themeColor="text1"/>
+        <w:bottom w:val="single" w:sz="4" w:space="0" w:color="000000" w:themeColor="text1"/>
+        <w:right w:val="single" w:sz="4" w:space="0" w:color="000000" w:themeColor="text1"/>
+        <w:insideH w:val="single" w:sz="4" w:space="0" w:color="000000" w:themeColor="text1"/>
+        <w:insideV w:val="single" w:sz="4" w:space="0" w:color="000000" w:themeColor="text1"/>
       </w:tblBorders>
     </w:tblPr>
   </w:style>
@@ -5858,7 +5952,7 @@
 </file>
 
 <file path=word/theme/theme1.xml><?xml version="1.0" encoding="utf-8"?>
-<a:theme xmlns:a="http://schemas.openxmlformats.org/drawingml/2006/main" xmlns:thm15="http://schemas.microsoft.com/office/thememl/2012/main" name="Office Theme">
+<a:theme xmlns:a="http://schemas.openxmlformats.org/drawingml/2006/main" name="Office Theme">
   <a:themeElements>
     <a:clrScheme name="Office">
       <a:dk1>

</xml_diff>